<commit_message>
Fixed NPE in BitmapItem and verified all tests passes
</commit_message>
<xml_diff>
--- a/Documents/Advice Document.docx
+++ b/Documents/Advice Document.docx
@@ -20,52 +20,32 @@
           <w:sz w:val="40"/>
           <w:szCs w:val="40"/>
         </w:rPr>
-        <w:t xml:space="preserve">Advice Document: </w:t>
-      </w:r>
-      <w:proofErr w:type="spellStart"/>
-      <w:r>
+        <w:t>Advice Document: JabberPoint Design Improvement</w:t>
+      </w:r>
+    </w:p>
+    <w:p>
+      <w:pPr>
+        <w:spacing w:after="0"/>
         <w:rPr>
           <w:b/>
           <w:bCs/>
-          <w:sz w:val="40"/>
-          <w:szCs w:val="40"/>
-        </w:rPr>
-        <w:t>JabberPoint</w:t>
-      </w:r>
-      <w:proofErr w:type="spellEnd"/>
+          <w:sz w:val="28"/>
+          <w:szCs w:val="28"/>
+        </w:rPr>
+      </w:pPr>
+    </w:p>
+    <w:p>
+      <w:pPr>
+        <w:spacing w:after="0"/>
+        <w:rPr>
+          <w:sz w:val="28"/>
+          <w:szCs w:val="28"/>
+        </w:rPr>
+      </w:pPr>
       <w:r>
         <w:rPr>
           <w:b/>
           <w:bCs/>
-          <w:sz w:val="40"/>
-          <w:szCs w:val="40"/>
-        </w:rPr>
-        <w:t xml:space="preserve"> Design Improvement</w:t>
-      </w:r>
-    </w:p>
-    <w:p>
-      <w:pPr>
-        <w:spacing w:after="0"/>
-        <w:rPr>
-          <w:b/>
-          <w:bCs/>
-          <w:sz w:val="28"/>
-          <w:szCs w:val="28"/>
-        </w:rPr>
-      </w:pPr>
-    </w:p>
-    <w:p>
-      <w:pPr>
-        <w:spacing w:after="0"/>
-        <w:rPr>
-          <w:sz w:val="28"/>
-          <w:szCs w:val="28"/>
-        </w:rPr>
-      </w:pPr>
-      <w:r>
-        <w:rPr>
-          <w:b/>
-          <w:bCs/>
           <w:sz w:val="28"/>
           <w:szCs w:val="28"/>
         </w:rPr>
@@ -76,23 +56,7 @@
           <w:sz w:val="28"/>
           <w:szCs w:val="28"/>
         </w:rPr>
-        <w:t xml:space="preserve">Eliza Horváth, </w:t>
-      </w:r>
-      <w:proofErr w:type="spellStart"/>
-      <w:r>
-        <w:rPr>
-          <w:sz w:val="28"/>
-          <w:szCs w:val="28"/>
-        </w:rPr>
-        <w:t>Airaa</w:t>
-      </w:r>
-      <w:proofErr w:type="spellEnd"/>
-      <w:r>
-        <w:rPr>
-          <w:sz w:val="28"/>
-          <w:szCs w:val="28"/>
-        </w:rPr>
-        <w:t xml:space="preserve"> Srinivasan, Sara Kiani Nejad</w:t>
+        <w:t>Eliza Horváth, Airaa Srinivasan, Sara Kiani Nejad</w:t>
       </w:r>
     </w:p>
     <w:p>
@@ -213,9 +177,8 @@
           <w:sz w:val="28"/>
           <w:szCs w:val="28"/>
         </w:rPr>
-        <w:t xml:space="preserve"> </w:t>
-      </w:r>
-      <w:proofErr w:type="spellStart"/>
+        <w:t xml:space="preserve"> src/ to src/main/java/n</w:t>
+      </w:r>
       <w:r>
         <w:rPr>
           <w:i/>
@@ -223,9 +186,8 @@
           <w:sz w:val="28"/>
           <w:szCs w:val="28"/>
         </w:rPr>
-        <w:t>src</w:t>
-      </w:r>
-      <w:proofErr w:type="spellEnd"/>
+        <w:t>hl</w:t>
+      </w:r>
       <w:r>
         <w:rPr>
           <w:i/>
@@ -233,85 +195,7 @@
           <w:sz w:val="28"/>
           <w:szCs w:val="28"/>
         </w:rPr>
-        <w:t xml:space="preserve">/ to </w:t>
-      </w:r>
-      <w:proofErr w:type="spellStart"/>
-      <w:r>
-        <w:rPr>
-          <w:i/>
-          <w:iCs/>
-          <w:sz w:val="28"/>
-          <w:szCs w:val="28"/>
-        </w:rPr>
-        <w:t>src</w:t>
-      </w:r>
-      <w:proofErr w:type="spellEnd"/>
-      <w:r>
-        <w:rPr>
-          <w:i/>
-          <w:iCs/>
-          <w:sz w:val="28"/>
-          <w:szCs w:val="28"/>
-        </w:rPr>
-        <w:t>/main/java/</w:t>
-      </w:r>
-      <w:proofErr w:type="spellStart"/>
-      <w:r>
-        <w:rPr>
-          <w:i/>
-          <w:iCs/>
-          <w:sz w:val="28"/>
-          <w:szCs w:val="28"/>
-        </w:rPr>
-        <w:t>n</w:t>
-      </w:r>
-      <w:r>
-        <w:rPr>
-          <w:i/>
-          <w:iCs/>
-          <w:sz w:val="28"/>
-          <w:szCs w:val="28"/>
-        </w:rPr>
-        <w:t>hl</w:t>
-      </w:r>
-      <w:r>
-        <w:rPr>
-          <w:i/>
-          <w:iCs/>
-          <w:sz w:val="28"/>
-          <w:szCs w:val="28"/>
-        </w:rPr>
-        <w:t>stenden</w:t>
-      </w:r>
-      <w:proofErr w:type="spellEnd"/>
-      <w:r>
-        <w:rPr>
-          <w:i/>
-          <w:iCs/>
-          <w:sz w:val="28"/>
-          <w:szCs w:val="28"/>
-        </w:rPr>
-        <w:t>/</w:t>
-      </w:r>
-      <w:proofErr w:type="spellStart"/>
-      <w:r>
-        <w:rPr>
-          <w:i/>
-          <w:iCs/>
-          <w:sz w:val="28"/>
-          <w:szCs w:val="28"/>
-        </w:rPr>
-        <w:t>jabberpoint</w:t>
-      </w:r>
-      <w:proofErr w:type="spellEnd"/>
-      <w:r>
-        <w:rPr>
-          <w:i/>
-          <w:iCs/>
-          <w:sz w:val="28"/>
-          <w:szCs w:val="28"/>
-        </w:rPr>
-        <w:t>/.</w:t>
+        <w:t>stenden/jabberpoint/.</w:t>
       </w:r>
     </w:p>
     <w:p>
@@ -357,23 +241,7 @@
           <w:sz w:val="28"/>
           <w:szCs w:val="28"/>
         </w:rPr>
-        <w:t xml:space="preserve"> the bin/ folder from the repository. Compiled files will now be automatically generated by Maven in the target/ folder, which is excluded from version control via .</w:t>
-      </w:r>
-      <w:proofErr w:type="spellStart"/>
-      <w:r>
-        <w:rPr>
-          <w:sz w:val="28"/>
-          <w:szCs w:val="28"/>
-        </w:rPr>
-        <w:t>gitignore</w:t>
-      </w:r>
-      <w:proofErr w:type="spellEnd"/>
-      <w:r>
-        <w:rPr>
-          <w:sz w:val="28"/>
-          <w:szCs w:val="28"/>
-        </w:rPr>
-        <w:t>.</w:t>
+        <w:t xml:space="preserve"> the bin/ folder from the repository. Compiled files will now be automatically generated by Maven in the target/ folder, which is excluded from version control via .gitignore.</w:t>
       </w:r>
     </w:p>
     <w:p>
@@ -445,23 +313,21 @@
           <w:sz w:val="28"/>
           <w:szCs w:val="28"/>
         </w:rPr>
-        <w:t xml:space="preserve"> In </w:t>
-      </w:r>
-      <w:proofErr w:type="spellStart"/>
-      <w:r>
-        <w:rPr>
-          <w:sz w:val="28"/>
-          <w:szCs w:val="28"/>
-        </w:rPr>
-        <w:t>SlideViewerFrame</w:t>
-      </w:r>
-      <w:proofErr w:type="spellEnd"/>
-      <w:r>
-        <w:rPr>
-          <w:sz w:val="28"/>
-          <w:szCs w:val="28"/>
-        </w:rPr>
-        <w:t>, the dimensions (1200x800) are hardcoded. These should be moved to a Constants.java or a configuration file.</w:t>
+        <w:t xml:space="preserve"> In SlideViewerFrame, the dimensions (1200x800) are hardcoded. These should be moved to a </w:t>
+      </w:r>
+      <w:r>
+        <w:rPr>
+          <w:sz w:val="28"/>
+          <w:szCs w:val="28"/>
+        </w:rPr>
+        <w:t>Resources</w:t>
+      </w:r>
+      <w:r>
+        <w:rPr>
+          <w:sz w:val="28"/>
+          <w:szCs w:val="28"/>
+        </w:rPr>
+        <w:t>.java or a configuration file.</w:t>
       </w:r>
     </w:p>
     <w:p>
@@ -560,25 +426,7 @@
           <w:szCs w:val="28"/>
           <w:lang w:val="en-US"/>
         </w:rPr>
-        <w:t xml:space="preserve"> The Presentation class is forced to know about the </w:t>
-      </w:r>
-      <w:proofErr w:type="spellStart"/>
-      <w:r>
-        <w:rPr>
-          <w:sz w:val="28"/>
-          <w:szCs w:val="28"/>
-          <w:lang w:val="en-US"/>
-        </w:rPr>
-        <w:t>SlideViewerComponent</w:t>
-      </w:r>
-      <w:proofErr w:type="spellEnd"/>
-      <w:r>
-        <w:rPr>
-          <w:sz w:val="28"/>
-          <w:szCs w:val="28"/>
-          <w:lang w:val="en-US"/>
-        </w:rPr>
-        <w:t xml:space="preserve"> to trigger updates. This makes the Model layer dependent on the View layer.</w:t>
+        <w:t xml:space="preserve"> The Presentation class is forced to know about the SlideViewerComponent to trigger updates. This makes the Model layer dependent on the View layer.</w:t>
       </w:r>
     </w:p>
     <w:p>
@@ -655,23 +503,7 @@
           <w:sz w:val="28"/>
           <w:szCs w:val="28"/>
         </w:rPr>
-        <w:t xml:space="preserve"> and </w:t>
-      </w:r>
-      <w:proofErr w:type="spellStart"/>
-      <w:r>
-        <w:rPr>
-          <w:sz w:val="28"/>
-          <w:szCs w:val="28"/>
-        </w:rPr>
-        <w:t>SlideViewerComponent</w:t>
-      </w:r>
-      <w:proofErr w:type="spellEnd"/>
-      <w:r>
-        <w:rPr>
-          <w:sz w:val="28"/>
-          <w:szCs w:val="28"/>
-        </w:rPr>
-        <w:t xml:space="preserve"> becomes the </w:t>
+        <w:t xml:space="preserve"> and SlideViewerComponent becomes the </w:t>
       </w:r>
       <w:r>
         <w:rPr>
@@ -867,23 +699,7 @@
           <w:sz w:val="28"/>
           <w:szCs w:val="28"/>
         </w:rPr>
-        <w:t xml:space="preserve">The </w:t>
-      </w:r>
-      <w:proofErr w:type="spellStart"/>
-      <w:r>
-        <w:rPr>
-          <w:sz w:val="28"/>
-          <w:szCs w:val="28"/>
-        </w:rPr>
-        <w:t>XMLAccessor</w:t>
-      </w:r>
-      <w:proofErr w:type="spellEnd"/>
-      <w:r>
-        <w:rPr>
-          <w:sz w:val="28"/>
-          <w:szCs w:val="28"/>
-        </w:rPr>
-        <w:t xml:space="preserve"> is doing too much. It reads files </w:t>
+        <w:t xml:space="preserve">The XMLAccessor is doing too much. It reads files </w:t>
       </w:r>
       <w:r>
         <w:rPr>
@@ -941,23 +757,7 @@
           <w:sz w:val="28"/>
           <w:szCs w:val="28"/>
         </w:rPr>
-        <w:t xml:space="preserve"> Use an Abstract Factory to handle the creation of </w:t>
-      </w:r>
-      <w:proofErr w:type="spellStart"/>
-      <w:r>
-        <w:rPr>
-          <w:sz w:val="28"/>
-          <w:szCs w:val="28"/>
-        </w:rPr>
-        <w:t>SlideItems</w:t>
-      </w:r>
-      <w:proofErr w:type="spellEnd"/>
-      <w:r>
-        <w:rPr>
-          <w:sz w:val="28"/>
-          <w:szCs w:val="28"/>
-        </w:rPr>
-        <w:t>.</w:t>
+        <w:t xml:space="preserve"> Use an Abstract Factory to handle the creation of SlideItems.</w:t>
       </w:r>
     </w:p>
     <w:p>
@@ -1008,23 +808,7 @@
           <w:sz w:val="28"/>
           <w:szCs w:val="28"/>
         </w:rPr>
-        <w:t xml:space="preserve">makes the system highly extensible for future media types (e.g., </w:t>
-      </w:r>
-      <w:proofErr w:type="spellStart"/>
-      <w:r>
-        <w:rPr>
-          <w:sz w:val="28"/>
-          <w:szCs w:val="28"/>
-        </w:rPr>
-        <w:t>VideoItem</w:t>
-      </w:r>
-      <w:proofErr w:type="spellEnd"/>
-      <w:r>
-        <w:rPr>
-          <w:sz w:val="28"/>
-          <w:szCs w:val="28"/>
-        </w:rPr>
-        <w:t>).</w:t>
+        <w:t>makes the system highly extensible for future media types (e.g., VideoItem).</w:t>
       </w:r>
     </w:p>
     <w:p>
@@ -1084,23 +868,7 @@
           <w:sz w:val="28"/>
           <w:szCs w:val="28"/>
         </w:rPr>
-        <w:t xml:space="preserve">In </w:t>
-      </w:r>
-      <w:proofErr w:type="spellStart"/>
-      <w:r>
-        <w:rPr>
-          <w:sz w:val="28"/>
-          <w:szCs w:val="28"/>
-        </w:rPr>
-        <w:t>JabberPoint</w:t>
-      </w:r>
-      <w:proofErr w:type="spellEnd"/>
-      <w:r>
-        <w:rPr>
-          <w:sz w:val="28"/>
-          <w:szCs w:val="28"/>
-        </w:rPr>
-        <w:t>, we aren't trying to "wrap" items</w:t>
+        <w:t>In JabberPoint, we aren't trying to "wrap" items</w:t>
       </w:r>
       <w:r>
         <w:rPr>
@@ -1381,23 +1149,7 @@
           <w:sz w:val="28"/>
           <w:szCs w:val="28"/>
         </w:rPr>
-        <w:t xml:space="preserve">In </w:t>
-      </w:r>
-      <w:proofErr w:type="spellStart"/>
-      <w:r>
-        <w:rPr>
-          <w:sz w:val="28"/>
-          <w:szCs w:val="28"/>
-        </w:rPr>
-        <w:t>JabberPoint</w:t>
-      </w:r>
-      <w:proofErr w:type="spellEnd"/>
-      <w:r>
-        <w:rPr>
-          <w:sz w:val="28"/>
-          <w:szCs w:val="28"/>
-        </w:rPr>
-        <w:t xml:space="preserve">, all the code is </w:t>
+        <w:t xml:space="preserve">In JabberPoint, all the code is </w:t>
       </w:r>
       <w:r>
         <w:rPr>
@@ -1538,23 +1290,7 @@
           <w:sz w:val="28"/>
           <w:szCs w:val="28"/>
         </w:rPr>
-        <w:t xml:space="preserve"> Using the </w:t>
-      </w:r>
-      <w:proofErr w:type="spellStart"/>
-      <w:r>
-        <w:rPr>
-          <w:sz w:val="28"/>
-          <w:szCs w:val="28"/>
-        </w:rPr>
-        <w:t>JaCoCo</w:t>
-      </w:r>
-      <w:proofErr w:type="spellEnd"/>
-      <w:r>
-        <w:rPr>
-          <w:sz w:val="28"/>
-          <w:szCs w:val="28"/>
-        </w:rPr>
-        <w:t xml:space="preserve"> plugin, the pipeline will fail if refactored classes do not meet the </w:t>
+        <w:t xml:space="preserve"> Using the JaCoCo plugin, the pipeline will fail if refactored classes do not meet the </w:t>
       </w:r>
       <w:r>
         <w:rPr>
@@ -1624,23 +1360,7 @@
           <w:sz w:val="28"/>
           <w:szCs w:val="28"/>
         </w:rPr>
-        <w:t xml:space="preserve">By implementing these three patterns and restructuring the project to Maven standards, we transition </w:t>
-      </w:r>
-      <w:proofErr w:type="spellStart"/>
-      <w:r>
-        <w:rPr>
-          <w:sz w:val="28"/>
-          <w:szCs w:val="28"/>
-        </w:rPr>
-        <w:t>JabberPoint</w:t>
-      </w:r>
-      <w:proofErr w:type="spellEnd"/>
-      <w:r>
-        <w:rPr>
-          <w:sz w:val="28"/>
-          <w:szCs w:val="28"/>
-        </w:rPr>
-        <w:t xml:space="preserve"> from a "working" program to a High-Quality Software Product that is maintainable, extensible, and ready for professional deployment.</w:t>
+        <w:t>By implementing these three patterns and restructuring the project to Maven standards, we transition JabberPoint from a "working" program to a High-Quality Software Product that is maintainable, extensible, and ready for professional deployment.</w:t>
       </w:r>
     </w:p>
     <w:sectPr>
@@ -3383,6 +3103,7 @@
   <w:style w:type="character" w:default="1" w:styleId="DefaultParagraphFont">
     <w:name w:val="Default Paragraph Font"/>
     <w:uiPriority w:val="1"/>
+    <w:semiHidden/>
     <w:unhideWhenUsed/>
   </w:style>
   <w:style w:type="table" w:default="1" w:styleId="TableNormal">

</xml_diff>

<commit_message>
Working on Abstract Factory and Java 21 fix
</commit_message>
<xml_diff>
--- a/Documents/Advice Document.docx
+++ b/Documents/Advice Document.docx
@@ -20,7 +20,27 @@
           <w:sz w:val="40"/>
           <w:szCs w:val="40"/>
         </w:rPr>
-        <w:t>Advice Document: JabberPoint Design Improvement</w:t>
+        <w:t xml:space="preserve">Advice Document: </w:t>
+      </w:r>
+      <w:proofErr w:type="spellStart"/>
+      <w:r>
+        <w:rPr>
+          <w:b/>
+          <w:bCs/>
+          <w:sz w:val="40"/>
+          <w:szCs w:val="40"/>
+        </w:rPr>
+        <w:t>JabberPoint</w:t>
+      </w:r>
+      <w:proofErr w:type="spellEnd"/>
+      <w:r>
+        <w:rPr>
+          <w:b/>
+          <w:bCs/>
+          <w:sz w:val="40"/>
+          <w:szCs w:val="40"/>
+        </w:rPr>
+        <w:t xml:space="preserve"> Design Improvement</w:t>
       </w:r>
     </w:p>
     <w:p>
@@ -56,7 +76,23 @@
           <w:sz w:val="28"/>
           <w:szCs w:val="28"/>
         </w:rPr>
-        <w:t>Eliza Horváth, Airaa Srinivasan, Sara Kiani Nejad</w:t>
+        <w:t xml:space="preserve">Eliza Horváth, </w:t>
+      </w:r>
+      <w:proofErr w:type="spellStart"/>
+      <w:r>
+        <w:rPr>
+          <w:sz w:val="28"/>
+          <w:szCs w:val="28"/>
+        </w:rPr>
+        <w:t>Airaa</w:t>
+      </w:r>
+      <w:proofErr w:type="spellEnd"/>
+      <w:r>
+        <w:rPr>
+          <w:sz w:val="28"/>
+          <w:szCs w:val="28"/>
+        </w:rPr>
+        <w:t xml:space="preserve"> Srinivasan, Sara Kiani Nejad</w:t>
       </w:r>
     </w:p>
     <w:p>
@@ -177,7 +213,105 @@
           <w:sz w:val="28"/>
           <w:szCs w:val="28"/>
         </w:rPr>
-        <w:t xml:space="preserve"> src/ to src/main/java/nl/stenden/jabberpoint/.</w:t>
+        <w:t xml:space="preserve"> </w:t>
+      </w:r>
+      <w:proofErr w:type="spellStart"/>
+      <w:r>
+        <w:rPr>
+          <w:i/>
+          <w:iCs/>
+          <w:sz w:val="28"/>
+          <w:szCs w:val="28"/>
+        </w:rPr>
+        <w:t>src</w:t>
+      </w:r>
+      <w:proofErr w:type="spellEnd"/>
+      <w:r>
+        <w:rPr>
+          <w:i/>
+          <w:iCs/>
+          <w:sz w:val="28"/>
+          <w:szCs w:val="28"/>
+        </w:rPr>
+        <w:t xml:space="preserve">/ to </w:t>
+      </w:r>
+      <w:proofErr w:type="spellStart"/>
+      <w:r>
+        <w:rPr>
+          <w:i/>
+          <w:iCs/>
+          <w:sz w:val="28"/>
+          <w:szCs w:val="28"/>
+        </w:rPr>
+        <w:t>src</w:t>
+      </w:r>
+      <w:proofErr w:type="spellEnd"/>
+      <w:r>
+        <w:rPr>
+          <w:i/>
+          <w:iCs/>
+          <w:sz w:val="28"/>
+          <w:szCs w:val="28"/>
+        </w:rPr>
+        <w:t>/main/java/</w:t>
+      </w:r>
+      <w:proofErr w:type="spellStart"/>
+      <w:r>
+        <w:rPr>
+          <w:i/>
+          <w:iCs/>
+          <w:sz w:val="28"/>
+          <w:szCs w:val="28"/>
+        </w:rPr>
+        <w:t>n</w:t>
+      </w:r>
+      <w:r>
+        <w:rPr>
+          <w:i/>
+          <w:iCs/>
+          <w:sz w:val="28"/>
+          <w:szCs w:val="28"/>
+        </w:rPr>
+        <w:t>hl</w:t>
+      </w:r>
+      <w:r>
+        <w:rPr>
+          <w:i/>
+          <w:iCs/>
+          <w:sz w:val="28"/>
+          <w:szCs w:val="28"/>
+        </w:rPr>
+        <w:t>stenden</w:t>
+      </w:r>
+      <w:proofErr w:type="spellEnd"/>
+      <w:r>
+        <w:rPr>
+          <w:i/>
+          <w:iCs/>
+          <w:sz w:val="28"/>
+          <w:szCs w:val="28"/>
+        </w:rPr>
+        <w:t>/</w:t>
+      </w:r>
+      <w:proofErr w:type="spellStart"/>
+      <w:r>
+        <w:rPr>
+          <w:i/>
+          <w:iCs/>
+          <w:sz w:val="28"/>
+          <w:szCs w:val="28"/>
+        </w:rPr>
+        <w:t>jabberpoint</w:t>
+      </w:r>
+      <w:proofErr w:type="spellEnd"/>
+      <w:r>
+        <w:rPr>
+          <w:i/>
+          <w:iCs/>
+          <w:sz w:val="28"/>
+          <w:szCs w:val="28"/>
+        </w:rPr>
+        <w:t>/.</w:t>
       </w:r>
     </w:p>
     <w:p>
@@ -207,21 +341,39 @@
           <w:sz w:val="28"/>
           <w:szCs w:val="28"/>
         </w:rPr>
-        <w:t xml:space="preserve"> Mov</w:t>
-      </w:r>
-      <w:r>
-        <w:rPr>
-          <w:sz w:val="28"/>
-          <w:szCs w:val="28"/>
-        </w:rPr>
-        <w:t>ing</w:t>
-      </w:r>
-      <w:r>
-        <w:rPr>
-          <w:sz w:val="28"/>
-          <w:szCs w:val="28"/>
-        </w:rPr>
-        <w:t xml:space="preserve"> all .class files out of the bin/ folder. Compiled files should be handled by the build tool in a target/ folder which is ignored by Git.</w:t>
+        <w:t xml:space="preserve"> </w:t>
+      </w:r>
+      <w:r>
+        <w:rPr>
+          <w:b/>
+          <w:bCs/>
+          <w:sz w:val="28"/>
+          <w:szCs w:val="28"/>
+        </w:rPr>
+        <w:t>Remove</w:t>
+      </w:r>
+      <w:r>
+        <w:rPr>
+          <w:sz w:val="28"/>
+          <w:szCs w:val="28"/>
+        </w:rPr>
+        <w:t xml:space="preserve"> the bin/ folder from the repository. Compiled files will now be automatically generated by Maven in the target/ folder, which is excluded from version control via .</w:t>
+      </w:r>
+      <w:proofErr w:type="spellStart"/>
+      <w:r>
+        <w:rPr>
+          <w:sz w:val="28"/>
+          <w:szCs w:val="28"/>
+        </w:rPr>
+        <w:t>gitignore</w:t>
+      </w:r>
+      <w:proofErr w:type="spellEnd"/>
+      <w:r>
+        <w:rPr>
+          <w:sz w:val="28"/>
+          <w:szCs w:val="28"/>
+        </w:rPr>
+        <w:t>.</w:t>
       </w:r>
     </w:p>
     <w:p>
@@ -293,7 +445,23 @@
           <w:sz w:val="28"/>
           <w:szCs w:val="28"/>
         </w:rPr>
-        <w:t xml:space="preserve"> In SlideViewerFrame, the dimensions (1200x800) are hardcoded. These should be moved to a Constants.java or a configuration file.</w:t>
+        <w:t xml:space="preserve"> In </w:t>
+      </w:r>
+      <w:proofErr w:type="spellStart"/>
+      <w:r>
+        <w:rPr>
+          <w:sz w:val="28"/>
+          <w:szCs w:val="28"/>
+        </w:rPr>
+        <w:t>SlideViewerFrame</w:t>
+      </w:r>
+      <w:proofErr w:type="spellEnd"/>
+      <w:r>
+        <w:rPr>
+          <w:sz w:val="28"/>
+          <w:szCs w:val="28"/>
+        </w:rPr>
+        <w:t>, the dimensions (1200x800) are hardcoded. These should be moved to a Constants.java or a configuration file.</w:t>
       </w:r>
     </w:p>
     <w:p>
@@ -392,7 +560,25 @@
           <w:szCs w:val="28"/>
           <w:lang w:val="en-US"/>
         </w:rPr>
-        <w:t xml:space="preserve"> The Presentation class is forced to know about the SlideViewerComponent to trigger updates. This makes the Model layer dependent on the View layer.</w:t>
+        <w:t xml:space="preserve"> The Presentation class is forced to know about the </w:t>
+      </w:r>
+      <w:proofErr w:type="spellStart"/>
+      <w:r>
+        <w:rPr>
+          <w:sz w:val="28"/>
+          <w:szCs w:val="28"/>
+          <w:lang w:val="en-US"/>
+        </w:rPr>
+        <w:t>SlideViewerComponent</w:t>
+      </w:r>
+      <w:proofErr w:type="spellEnd"/>
+      <w:r>
+        <w:rPr>
+          <w:sz w:val="28"/>
+          <w:szCs w:val="28"/>
+          <w:lang w:val="en-US"/>
+        </w:rPr>
+        <w:t xml:space="preserve"> to trigger updates. This makes the Model layer dependent on the View layer.</w:t>
       </w:r>
     </w:p>
     <w:p>
@@ -469,7 +655,23 @@
           <w:sz w:val="28"/>
           <w:szCs w:val="28"/>
         </w:rPr>
-        <w:t xml:space="preserve"> and SlideViewerComponent becomes the </w:t>
+        <w:t xml:space="preserve"> and </w:t>
+      </w:r>
+      <w:proofErr w:type="spellStart"/>
+      <w:r>
+        <w:rPr>
+          <w:sz w:val="28"/>
+          <w:szCs w:val="28"/>
+        </w:rPr>
+        <w:t>SlideViewerComponent</w:t>
+      </w:r>
+      <w:proofErr w:type="spellEnd"/>
+      <w:r>
+        <w:rPr>
+          <w:sz w:val="28"/>
+          <w:szCs w:val="28"/>
+        </w:rPr>
+        <w:t xml:space="preserve"> becomes the </w:t>
       </w:r>
       <w:r>
         <w:rPr>
@@ -665,7 +867,23 @@
           <w:sz w:val="28"/>
           <w:szCs w:val="28"/>
         </w:rPr>
-        <w:t xml:space="preserve">The XMLAccessor is doing too much. It reads files </w:t>
+        <w:t xml:space="preserve">The </w:t>
+      </w:r>
+      <w:proofErr w:type="spellStart"/>
+      <w:r>
+        <w:rPr>
+          <w:sz w:val="28"/>
+          <w:szCs w:val="28"/>
+        </w:rPr>
+        <w:t>XMLAccessor</w:t>
+      </w:r>
+      <w:proofErr w:type="spellEnd"/>
+      <w:r>
+        <w:rPr>
+          <w:sz w:val="28"/>
+          <w:szCs w:val="28"/>
+        </w:rPr>
+        <w:t xml:space="preserve"> is doing too much. It reads files </w:t>
       </w:r>
       <w:r>
         <w:rPr>
@@ -723,7 +941,23 @@
           <w:sz w:val="28"/>
           <w:szCs w:val="28"/>
         </w:rPr>
-        <w:t xml:space="preserve"> Use an Abstract Factory to handle the creation of SlideItems.</w:t>
+        <w:t xml:space="preserve"> Use an Abstract Factory to handle the creation of </w:t>
+      </w:r>
+      <w:proofErr w:type="spellStart"/>
+      <w:r>
+        <w:rPr>
+          <w:sz w:val="28"/>
+          <w:szCs w:val="28"/>
+        </w:rPr>
+        <w:t>SlideItems</w:t>
+      </w:r>
+      <w:proofErr w:type="spellEnd"/>
+      <w:r>
+        <w:rPr>
+          <w:sz w:val="28"/>
+          <w:szCs w:val="28"/>
+        </w:rPr>
+        <w:t>.</w:t>
       </w:r>
     </w:p>
     <w:p>
@@ -774,7 +1008,23 @@
           <w:sz w:val="28"/>
           <w:szCs w:val="28"/>
         </w:rPr>
-        <w:t>makes the system highly extensible for future media types (e.g., VideoItem).</w:t>
+        <w:t xml:space="preserve">makes the system highly extensible for future media types (e.g., </w:t>
+      </w:r>
+      <w:proofErr w:type="spellStart"/>
+      <w:r>
+        <w:rPr>
+          <w:sz w:val="28"/>
+          <w:szCs w:val="28"/>
+        </w:rPr>
+        <w:t>VideoItem</w:t>
+      </w:r>
+      <w:proofErr w:type="spellEnd"/>
+      <w:r>
+        <w:rPr>
+          <w:sz w:val="28"/>
+          <w:szCs w:val="28"/>
+        </w:rPr>
+        <w:t>).</w:t>
       </w:r>
     </w:p>
     <w:p>
@@ -834,7 +1084,23 @@
           <w:sz w:val="28"/>
           <w:szCs w:val="28"/>
         </w:rPr>
-        <w:t>In JabberPoint, we aren't trying to "wrap" items</w:t>
+        <w:t xml:space="preserve">In </w:t>
+      </w:r>
+      <w:proofErr w:type="spellStart"/>
+      <w:r>
+        <w:rPr>
+          <w:sz w:val="28"/>
+          <w:szCs w:val="28"/>
+        </w:rPr>
+        <w:t>JabberPoint</w:t>
+      </w:r>
+      <w:proofErr w:type="spellEnd"/>
+      <w:r>
+        <w:rPr>
+          <w:sz w:val="28"/>
+          <w:szCs w:val="28"/>
+        </w:rPr>
+        <w:t>, we aren't trying to "wrap" items</w:t>
       </w:r>
       <w:r>
         <w:rPr>
@@ -1115,7 +1381,23 @@
           <w:sz w:val="28"/>
           <w:szCs w:val="28"/>
         </w:rPr>
-        <w:t xml:space="preserve">In JabberPoint, all the code is </w:t>
+        <w:t xml:space="preserve">In </w:t>
+      </w:r>
+      <w:proofErr w:type="spellStart"/>
+      <w:r>
+        <w:rPr>
+          <w:sz w:val="28"/>
+          <w:szCs w:val="28"/>
+        </w:rPr>
+        <w:t>JabberPoint</w:t>
+      </w:r>
+      <w:proofErr w:type="spellEnd"/>
+      <w:r>
+        <w:rPr>
+          <w:sz w:val="28"/>
+          <w:szCs w:val="28"/>
+        </w:rPr>
+        <w:t xml:space="preserve">, all the code is </w:t>
       </w:r>
       <w:r>
         <w:rPr>
@@ -1256,7 +1538,23 @@
           <w:sz w:val="28"/>
           <w:szCs w:val="28"/>
         </w:rPr>
-        <w:t xml:space="preserve"> Using the JaCoCo plugin, the pipeline will fail if refactored classes do not meet the </w:t>
+        <w:t xml:space="preserve"> Using the </w:t>
+      </w:r>
+      <w:proofErr w:type="spellStart"/>
+      <w:r>
+        <w:rPr>
+          <w:sz w:val="28"/>
+          <w:szCs w:val="28"/>
+        </w:rPr>
+        <w:t>JaCoCo</w:t>
+      </w:r>
+      <w:proofErr w:type="spellEnd"/>
+      <w:r>
+        <w:rPr>
+          <w:sz w:val="28"/>
+          <w:szCs w:val="28"/>
+        </w:rPr>
+        <w:t xml:space="preserve"> plugin, the pipeline will fail if refactored classes do not meet the </w:t>
       </w:r>
       <w:r>
         <w:rPr>
@@ -1326,7 +1624,23 @@
           <w:sz w:val="28"/>
           <w:szCs w:val="28"/>
         </w:rPr>
-        <w:t>By implementing these three patterns and restructuring the project to Maven standards, we transition JabberPoint from a "working" program to a High-Quality Software Product that is maintainable, extensible, and ready for professional deployment.</w:t>
+        <w:t xml:space="preserve">By implementing these three patterns and restructuring the project to Maven standards, we transition </w:t>
+      </w:r>
+      <w:proofErr w:type="spellStart"/>
+      <w:r>
+        <w:rPr>
+          <w:sz w:val="28"/>
+          <w:szCs w:val="28"/>
+        </w:rPr>
+        <w:t>JabberPoint</w:t>
+      </w:r>
+      <w:proofErr w:type="spellEnd"/>
+      <w:r>
+        <w:rPr>
+          <w:sz w:val="28"/>
+          <w:szCs w:val="28"/>
+        </w:rPr>
+        <w:t xml:space="preserve"> from a "working" program to a High-Quality Software Product that is maintainable, extensible, and ready for professional deployment.</w:t>
       </w:r>
     </w:p>
     <w:sectPr>
@@ -3069,7 +3383,6 @@
   <w:style w:type="character" w:default="1" w:styleId="DefaultParagraphFont">
     <w:name w:val="Default Paragraph Font"/>
     <w:uiPriority w:val="1"/>
-    <w:semiHidden/>
     <w:unhideWhenUsed/>
   </w:style>
   <w:style w:type="table" w:default="1" w:styleId="TableNormal">

</xml_diff>

<commit_message>
edited advice document: added SOLID principles table
</commit_message>
<xml_diff>
--- a/Documents/Advice Document.docx
+++ b/Documents/Advice Document.docx
@@ -20,52 +20,32 @@
           <w:sz w:val="40"/>
           <w:szCs w:val="40"/>
         </w:rPr>
-        <w:t xml:space="preserve">Advice Document: </w:t>
-      </w:r>
-      <w:proofErr w:type="spellStart"/>
-      <w:r>
+        <w:t>Advice Document: JabberPoint Design Improvement</w:t>
+      </w:r>
+    </w:p>
+    <w:p>
+      <w:pPr>
+        <w:spacing w:after="0"/>
         <w:rPr>
           <w:b/>
           <w:bCs/>
-          <w:sz w:val="40"/>
-          <w:szCs w:val="40"/>
-        </w:rPr>
-        <w:t>JabberPoint</w:t>
-      </w:r>
-      <w:proofErr w:type="spellEnd"/>
+          <w:sz w:val="28"/>
+          <w:szCs w:val="28"/>
+        </w:rPr>
+      </w:pPr>
+    </w:p>
+    <w:p>
+      <w:pPr>
+        <w:spacing w:after="0"/>
+        <w:rPr>
+          <w:sz w:val="28"/>
+          <w:szCs w:val="28"/>
+        </w:rPr>
+      </w:pPr>
       <w:r>
         <w:rPr>
           <w:b/>
           <w:bCs/>
-          <w:sz w:val="40"/>
-          <w:szCs w:val="40"/>
-        </w:rPr>
-        <w:t xml:space="preserve"> Design Improvement</w:t>
-      </w:r>
-    </w:p>
-    <w:p>
-      <w:pPr>
-        <w:spacing w:after="0"/>
-        <w:rPr>
-          <w:b/>
-          <w:bCs/>
-          <w:sz w:val="28"/>
-          <w:szCs w:val="28"/>
-        </w:rPr>
-      </w:pPr>
-    </w:p>
-    <w:p>
-      <w:pPr>
-        <w:spacing w:after="0"/>
-        <w:rPr>
-          <w:sz w:val="28"/>
-          <w:szCs w:val="28"/>
-        </w:rPr>
-      </w:pPr>
-      <w:r>
-        <w:rPr>
-          <w:b/>
-          <w:bCs/>
           <w:sz w:val="28"/>
           <w:szCs w:val="28"/>
         </w:rPr>
@@ -76,23 +56,7 @@
           <w:sz w:val="28"/>
           <w:szCs w:val="28"/>
         </w:rPr>
-        <w:t xml:space="preserve">Eliza Horváth, </w:t>
-      </w:r>
-      <w:proofErr w:type="spellStart"/>
-      <w:r>
-        <w:rPr>
-          <w:sz w:val="28"/>
-          <w:szCs w:val="28"/>
-        </w:rPr>
-        <w:t>Airaa</w:t>
-      </w:r>
-      <w:proofErr w:type="spellEnd"/>
-      <w:r>
-        <w:rPr>
-          <w:sz w:val="28"/>
-          <w:szCs w:val="28"/>
-        </w:rPr>
-        <w:t xml:space="preserve"> Srinivasan, Sara Kiani Nejad</w:t>
+        <w:t>Eliza Horváth, Airaa Srinivasan, Sara Kiani Nejad</w:t>
       </w:r>
     </w:p>
     <w:p>
@@ -213,9 +177,8 @@
           <w:sz w:val="28"/>
           <w:szCs w:val="28"/>
         </w:rPr>
-        <w:t xml:space="preserve"> </w:t>
-      </w:r>
-      <w:proofErr w:type="spellStart"/>
+        <w:t xml:space="preserve"> src/ to src/main/java/n</w:t>
+      </w:r>
       <w:r>
         <w:rPr>
           <w:i/>
@@ -223,9 +186,8 @@
           <w:sz w:val="28"/>
           <w:szCs w:val="28"/>
         </w:rPr>
-        <w:t>src</w:t>
-      </w:r>
-      <w:proofErr w:type="spellEnd"/>
+        <w:t>hl</w:t>
+      </w:r>
       <w:r>
         <w:rPr>
           <w:i/>
@@ -233,85 +195,7 @@
           <w:sz w:val="28"/>
           <w:szCs w:val="28"/>
         </w:rPr>
-        <w:t xml:space="preserve">/ to </w:t>
-      </w:r>
-      <w:proofErr w:type="spellStart"/>
-      <w:r>
-        <w:rPr>
-          <w:i/>
-          <w:iCs/>
-          <w:sz w:val="28"/>
-          <w:szCs w:val="28"/>
-        </w:rPr>
-        <w:t>src</w:t>
-      </w:r>
-      <w:proofErr w:type="spellEnd"/>
-      <w:r>
-        <w:rPr>
-          <w:i/>
-          <w:iCs/>
-          <w:sz w:val="28"/>
-          <w:szCs w:val="28"/>
-        </w:rPr>
-        <w:t>/main/java/</w:t>
-      </w:r>
-      <w:proofErr w:type="spellStart"/>
-      <w:r>
-        <w:rPr>
-          <w:i/>
-          <w:iCs/>
-          <w:sz w:val="28"/>
-          <w:szCs w:val="28"/>
-        </w:rPr>
-        <w:t>n</w:t>
-      </w:r>
-      <w:r>
-        <w:rPr>
-          <w:i/>
-          <w:iCs/>
-          <w:sz w:val="28"/>
-          <w:szCs w:val="28"/>
-        </w:rPr>
-        <w:t>hl</w:t>
-      </w:r>
-      <w:r>
-        <w:rPr>
-          <w:i/>
-          <w:iCs/>
-          <w:sz w:val="28"/>
-          <w:szCs w:val="28"/>
-        </w:rPr>
-        <w:t>stenden</w:t>
-      </w:r>
-      <w:proofErr w:type="spellEnd"/>
-      <w:r>
-        <w:rPr>
-          <w:i/>
-          <w:iCs/>
-          <w:sz w:val="28"/>
-          <w:szCs w:val="28"/>
-        </w:rPr>
-        <w:t>/</w:t>
-      </w:r>
-      <w:proofErr w:type="spellStart"/>
-      <w:r>
-        <w:rPr>
-          <w:i/>
-          <w:iCs/>
-          <w:sz w:val="28"/>
-          <w:szCs w:val="28"/>
-        </w:rPr>
-        <w:t>jabberpoint</w:t>
-      </w:r>
-      <w:proofErr w:type="spellEnd"/>
-      <w:r>
-        <w:rPr>
-          <w:i/>
-          <w:iCs/>
-          <w:sz w:val="28"/>
-          <w:szCs w:val="28"/>
-        </w:rPr>
-        <w:t>/.</w:t>
+        <w:t>stenden/jabberpoint/.</w:t>
       </w:r>
     </w:p>
     <w:p>
@@ -357,23 +241,7 @@
           <w:sz w:val="28"/>
           <w:szCs w:val="28"/>
         </w:rPr>
-        <w:t xml:space="preserve"> the bin/ folder from the repository. Compiled files will now be automatically generated by Maven in the target/ folder, which is excluded from version control via .</w:t>
-      </w:r>
-      <w:proofErr w:type="spellStart"/>
-      <w:r>
-        <w:rPr>
-          <w:sz w:val="28"/>
-          <w:szCs w:val="28"/>
-        </w:rPr>
-        <w:t>gitignore</w:t>
-      </w:r>
-      <w:proofErr w:type="spellEnd"/>
-      <w:r>
-        <w:rPr>
-          <w:sz w:val="28"/>
-          <w:szCs w:val="28"/>
-        </w:rPr>
-        <w:t>.</w:t>
+        <w:t xml:space="preserve"> the bin/ folder from the repository. Compiled files will now be automatically generated by Maven in the target/ folder, which is excluded from version control via .gitignore.</w:t>
       </w:r>
     </w:p>
     <w:p>
@@ -445,23 +313,42 @@
           <w:sz w:val="28"/>
           <w:szCs w:val="28"/>
         </w:rPr>
-        <w:t xml:space="preserve"> In </w:t>
-      </w:r>
-      <w:proofErr w:type="spellStart"/>
-      <w:r>
-        <w:rPr>
-          <w:sz w:val="28"/>
-          <w:szCs w:val="28"/>
-        </w:rPr>
-        <w:t>SlideViewerFrame</w:t>
-      </w:r>
-      <w:proofErr w:type="spellEnd"/>
-      <w:r>
-        <w:rPr>
-          <w:sz w:val="28"/>
-          <w:szCs w:val="28"/>
-        </w:rPr>
-        <w:t>, the dimensions (1200x800) are hardcoded. These should be moved to a Constants.java or a configuration file.</w:t>
+        <w:t xml:space="preserve"> In SlideViewerFrame, the dimensions (1200x800) are hardcoded. </w:t>
+      </w:r>
+      <w:r>
+        <w:rPr>
+          <w:sz w:val="28"/>
+          <w:szCs w:val="28"/>
+        </w:rPr>
+        <w:t xml:space="preserve">These have been moved to a </w:t>
+      </w:r>
+      <w:r>
+        <w:rPr>
+          <w:sz w:val="28"/>
+          <w:szCs w:val="28"/>
+        </w:rPr>
+        <w:t>Resources utility class</w:t>
+      </w:r>
+      <w:r>
+        <w:rPr>
+          <w:sz w:val="28"/>
+          <w:szCs w:val="28"/>
+        </w:rPr>
+        <w:t xml:space="preserve"> in the util package. This provides a Single Source of Truth, improving </w:t>
+      </w:r>
+      <w:r>
+        <w:rPr>
+          <w:sz w:val="28"/>
+          <w:szCs w:val="28"/>
+        </w:rPr>
+        <w:t>Maintainability</w:t>
+      </w:r>
+      <w:r>
+        <w:rPr>
+          <w:sz w:val="28"/>
+          <w:szCs w:val="28"/>
+        </w:rPr>
+        <w:t xml:space="preserve"> and allowing for easy scaling of the UI."</w:t>
       </w:r>
     </w:p>
     <w:p>
@@ -552,6 +439,7 @@
           <w:szCs w:val="28"/>
           <w:lang w:val="en-US"/>
         </w:rPr>
+        <w:lastRenderedPageBreak/>
         <w:t>Problem:</w:t>
       </w:r>
       <w:r>
@@ -560,25 +448,7 @@
           <w:szCs w:val="28"/>
           <w:lang w:val="en-US"/>
         </w:rPr>
-        <w:t xml:space="preserve"> The Presentation class is forced to know about the </w:t>
-      </w:r>
-      <w:proofErr w:type="spellStart"/>
-      <w:r>
-        <w:rPr>
-          <w:sz w:val="28"/>
-          <w:szCs w:val="28"/>
-          <w:lang w:val="en-US"/>
-        </w:rPr>
-        <w:t>SlideViewerComponent</w:t>
-      </w:r>
-      <w:proofErr w:type="spellEnd"/>
-      <w:r>
-        <w:rPr>
-          <w:sz w:val="28"/>
-          <w:szCs w:val="28"/>
-          <w:lang w:val="en-US"/>
-        </w:rPr>
-        <w:t xml:space="preserve"> to trigger updates. This makes the Model layer dependent on the View layer.</w:t>
+        <w:t xml:space="preserve"> The Presentation class is forced to know about the SlideViewerComponent to trigger updates. This makes the Model layer dependent on the View layer.</w:t>
       </w:r>
     </w:p>
     <w:p>
@@ -601,7 +471,6 @@
           <w:sz w:val="28"/>
           <w:szCs w:val="28"/>
         </w:rPr>
-        <w:lastRenderedPageBreak/>
         <w:t>Solution:</w:t>
       </w:r>
       <w:r>
@@ -655,23 +524,7 @@
           <w:sz w:val="28"/>
           <w:szCs w:val="28"/>
         </w:rPr>
-        <w:t xml:space="preserve"> and </w:t>
-      </w:r>
-      <w:proofErr w:type="spellStart"/>
-      <w:r>
-        <w:rPr>
-          <w:sz w:val="28"/>
-          <w:szCs w:val="28"/>
-        </w:rPr>
-        <w:t>SlideViewerComponent</w:t>
-      </w:r>
-      <w:proofErr w:type="spellEnd"/>
-      <w:r>
-        <w:rPr>
-          <w:sz w:val="28"/>
-          <w:szCs w:val="28"/>
-        </w:rPr>
-        <w:t xml:space="preserve"> becomes the </w:t>
+        <w:t xml:space="preserve"> and SlideViewerComponent becomes the </w:t>
       </w:r>
       <w:r>
         <w:rPr>
@@ -867,23 +720,7 @@
           <w:sz w:val="28"/>
           <w:szCs w:val="28"/>
         </w:rPr>
-        <w:t xml:space="preserve">The </w:t>
-      </w:r>
-      <w:proofErr w:type="spellStart"/>
-      <w:r>
-        <w:rPr>
-          <w:sz w:val="28"/>
-          <w:szCs w:val="28"/>
-        </w:rPr>
-        <w:t>XMLAccessor</w:t>
-      </w:r>
-      <w:proofErr w:type="spellEnd"/>
-      <w:r>
-        <w:rPr>
-          <w:sz w:val="28"/>
-          <w:szCs w:val="28"/>
-        </w:rPr>
-        <w:t xml:space="preserve"> is doing too much. It reads files </w:t>
+        <w:t xml:space="preserve">The XMLAccessor is doing too much. It reads files </w:t>
       </w:r>
       <w:r>
         <w:rPr>
@@ -941,23 +778,7 @@
           <w:sz w:val="28"/>
           <w:szCs w:val="28"/>
         </w:rPr>
-        <w:t xml:space="preserve"> Use an Abstract Factory to handle the creation of </w:t>
-      </w:r>
-      <w:proofErr w:type="spellStart"/>
-      <w:r>
-        <w:rPr>
-          <w:sz w:val="28"/>
-          <w:szCs w:val="28"/>
-        </w:rPr>
-        <w:t>SlideItems</w:t>
-      </w:r>
-      <w:proofErr w:type="spellEnd"/>
-      <w:r>
-        <w:rPr>
-          <w:sz w:val="28"/>
-          <w:szCs w:val="28"/>
-        </w:rPr>
-        <w:t>.</w:t>
+        <w:t xml:space="preserve"> Use an Abstract Factory to handle the creation of SlideItems.</w:t>
       </w:r>
     </w:p>
     <w:p>
@@ -1008,23 +829,7 @@
           <w:sz w:val="28"/>
           <w:szCs w:val="28"/>
         </w:rPr>
-        <w:t xml:space="preserve">makes the system highly extensible for future media types (e.g., </w:t>
-      </w:r>
-      <w:proofErr w:type="spellStart"/>
-      <w:r>
-        <w:rPr>
-          <w:sz w:val="28"/>
-          <w:szCs w:val="28"/>
-        </w:rPr>
-        <w:t>VideoItem</w:t>
-      </w:r>
-      <w:proofErr w:type="spellEnd"/>
-      <w:r>
-        <w:rPr>
-          <w:sz w:val="28"/>
-          <w:szCs w:val="28"/>
-        </w:rPr>
-        <w:t>).</w:t>
+        <w:t>makes the system highly extensible for future media types (e.g., VideoItem).</w:t>
       </w:r>
     </w:p>
     <w:p>
@@ -1084,23 +889,7 @@
           <w:sz w:val="28"/>
           <w:szCs w:val="28"/>
         </w:rPr>
-        <w:t xml:space="preserve">In </w:t>
-      </w:r>
-      <w:proofErr w:type="spellStart"/>
-      <w:r>
-        <w:rPr>
-          <w:sz w:val="28"/>
-          <w:szCs w:val="28"/>
-        </w:rPr>
-        <w:t>JabberPoint</w:t>
-      </w:r>
-      <w:proofErr w:type="spellEnd"/>
-      <w:r>
-        <w:rPr>
-          <w:sz w:val="28"/>
-          <w:szCs w:val="28"/>
-        </w:rPr>
-        <w:t>, we aren't trying to "wrap" items</w:t>
+        <w:t>In JabberPoint, we aren't trying to "wrap" items</w:t>
       </w:r>
       <w:r>
         <w:rPr>
@@ -1143,6 +932,75 @@
           <w:szCs w:val="28"/>
         </w:rPr>
         <w:t xml:space="preserve"> problem.</w:t>
+      </w:r>
+    </w:p>
+    <w:p>
+      <w:pPr>
+        <w:pStyle w:val="ListParagraph"/>
+        <w:numPr>
+          <w:ilvl w:val="0"/>
+          <w:numId w:val="6"/>
+        </w:numPr>
+        <w:spacing w:after="0"/>
+        <w:rPr>
+          <w:sz w:val="28"/>
+          <w:szCs w:val="28"/>
+        </w:rPr>
+      </w:pPr>
+      <w:r>
+        <w:rPr>
+          <w:sz w:val="28"/>
+          <w:szCs w:val="28"/>
+        </w:rPr>
+        <w:t xml:space="preserve">We considered a </w:t>
+      </w:r>
+      <w:r>
+        <w:rPr>
+          <w:b/>
+          <w:bCs/>
+          <w:sz w:val="28"/>
+          <w:szCs w:val="28"/>
+        </w:rPr>
+        <w:t>Simple Factory</w:t>
+      </w:r>
+      <w:r>
+        <w:rPr>
+          <w:sz w:val="28"/>
+          <w:szCs w:val="28"/>
+        </w:rPr>
+        <w:t xml:space="preserve">, but chose </w:t>
+      </w:r>
+      <w:r>
+        <w:rPr>
+          <w:b/>
+          <w:bCs/>
+          <w:sz w:val="28"/>
+          <w:szCs w:val="28"/>
+        </w:rPr>
+        <w:t>Abstract Factory</w:t>
+      </w:r>
+      <w:r>
+        <w:rPr>
+          <w:sz w:val="28"/>
+          <w:szCs w:val="28"/>
+        </w:rPr>
+        <w:t xml:space="preserve"> because it allows for a higher level of abstraction. While a Simple Factory only hides the new keyword, the Abstract Factory ensures that the XMLAccessor is entirely decoupled from the concrete implementation of SlideItem subclasses, fulfilling the Dependency Inversion Principle (DIP</w:t>
+      </w:r>
+      <w:r>
+        <w:rPr>
+          <w:b/>
+          <w:bCs/>
+          <w:sz w:val="28"/>
+          <w:szCs w:val="28"/>
+        </w:rPr>
+        <w:t>)</w:t>
+      </w:r>
+      <w:r>
+        <w:rPr>
+          <w:sz w:val="28"/>
+          <w:szCs w:val="28"/>
+        </w:rPr>
+        <w:t>."</w:t>
       </w:r>
     </w:p>
     <w:p>
@@ -1329,15 +1187,7 @@
           <w:sz w:val="28"/>
           <w:szCs w:val="28"/>
         </w:rPr>
-        <w:t xml:space="preserve"> A Singleton ensures a single "Source of Truth" for the application's appearance. It provides a global access point while </w:t>
-      </w:r>
-      <w:r>
-        <w:rPr>
-          <w:sz w:val="28"/>
-          <w:szCs w:val="28"/>
-        </w:rPr>
-        <w:lastRenderedPageBreak/>
-        <w:t>allowing us to implement the "Lazy Initialization" shown in the lecture slides, improving memory efficiency.</w:t>
+        <w:t xml:space="preserve"> A Singleton ensures a single "Source of Truth" for the application's appearance. It provides a global access point while allowing us to implement the "Lazy Initialization" shown in the lecture slides, improving memory efficiency.</w:t>
       </w:r>
     </w:p>
     <w:p>
@@ -1381,23 +1231,7 @@
           <w:sz w:val="28"/>
           <w:szCs w:val="28"/>
         </w:rPr>
-        <w:t xml:space="preserve">In </w:t>
-      </w:r>
-      <w:proofErr w:type="spellStart"/>
-      <w:r>
-        <w:rPr>
-          <w:sz w:val="28"/>
-          <w:szCs w:val="28"/>
-        </w:rPr>
-        <w:t>JabberPoint</w:t>
-      </w:r>
-      <w:proofErr w:type="spellEnd"/>
-      <w:r>
-        <w:rPr>
-          <w:sz w:val="28"/>
-          <w:szCs w:val="28"/>
-        </w:rPr>
-        <w:t xml:space="preserve">, all the code is </w:t>
+        <w:t xml:space="preserve">In JabberPoint, all the code is </w:t>
       </w:r>
       <w:r>
         <w:rPr>
@@ -1454,6 +1288,43 @@
           <w:szCs w:val="28"/>
         </w:rPr>
         <w:t xml:space="preserve"> problem, which is what Singleton addresses.</w:t>
+      </w:r>
+    </w:p>
+    <w:p>
+      <w:pPr>
+        <w:pStyle w:val="ListParagraph"/>
+        <w:numPr>
+          <w:ilvl w:val="0"/>
+          <w:numId w:val="7"/>
+        </w:numPr>
+        <w:spacing w:after="0"/>
+        <w:rPr>
+          <w:sz w:val="28"/>
+          <w:szCs w:val="28"/>
+        </w:rPr>
+      </w:pPr>
+      <w:r>
+        <w:rPr>
+          <w:sz w:val="28"/>
+          <w:szCs w:val="28"/>
+        </w:rPr>
+        <w:t xml:space="preserve">We weighed this against a </w:t>
+      </w:r>
+      <w:r>
+        <w:rPr>
+          <w:b/>
+          <w:bCs/>
+          <w:sz w:val="28"/>
+          <w:szCs w:val="28"/>
+        </w:rPr>
+        <w:t>Prototype</w:t>
+      </w:r>
+      <w:r>
+        <w:rPr>
+          <w:sz w:val="28"/>
+          <w:szCs w:val="28"/>
+        </w:rPr>
+        <w:t xml:space="preserve"> pattern. While Prototype is good for cloning complex objects, our Style configuration is global and unique. A Singleton is the superior choice here as it manages a shared global state (fonts/colors) without the memory overhead of multiple instances."</w:t>
       </w:r>
     </w:p>
     <w:p>
@@ -1531,30 +1402,32 @@
           <w:sz w:val="28"/>
           <w:szCs w:val="28"/>
         </w:rPr>
-        <w:t>70% Coverage Rule:</w:t>
-      </w:r>
-      <w:r>
-        <w:rPr>
-          <w:sz w:val="28"/>
-          <w:szCs w:val="28"/>
-        </w:rPr>
-        <w:t xml:space="preserve"> Using the </w:t>
-      </w:r>
-      <w:proofErr w:type="spellStart"/>
-      <w:r>
-        <w:rPr>
-          <w:sz w:val="28"/>
-          <w:szCs w:val="28"/>
-        </w:rPr>
-        <w:t>JaCoCo</w:t>
-      </w:r>
-      <w:proofErr w:type="spellEnd"/>
-      <w:r>
-        <w:rPr>
-          <w:sz w:val="28"/>
-          <w:szCs w:val="28"/>
-        </w:rPr>
-        <w:t xml:space="preserve"> plugin, the pipeline will fail if refactored classes do not meet the </w:t>
+        <w:t>7</w:t>
+      </w:r>
+      <w:r>
+        <w:rPr>
+          <w:b/>
+          <w:bCs/>
+          <w:sz w:val="28"/>
+          <w:szCs w:val="28"/>
+        </w:rPr>
+        <w:t>5</w:t>
+      </w:r>
+      <w:r>
+        <w:rPr>
+          <w:b/>
+          <w:bCs/>
+          <w:sz w:val="28"/>
+          <w:szCs w:val="28"/>
+        </w:rPr>
+        <w:t>% Coverage Rule:</w:t>
+      </w:r>
+      <w:r>
+        <w:rPr>
+          <w:sz w:val="28"/>
+          <w:szCs w:val="28"/>
+        </w:rPr>
+        <w:t xml:space="preserve"> Using the JaCoCo plugin, the pipeline will fail if refactored classes do not meet the </w:t>
       </w:r>
       <w:r>
         <w:rPr>
@@ -1602,6 +1475,115 @@
     </w:p>
     <w:p>
       <w:pPr>
+        <w:pStyle w:val="ListParagraph"/>
+        <w:numPr>
+          <w:ilvl w:val="0"/>
+          <w:numId w:val="10"/>
+        </w:numPr>
+        <w:rPr>
+          <w:sz w:val="28"/>
+          <w:szCs w:val="28"/>
+        </w:rPr>
+      </w:pPr>
+      <w:r>
+        <w:rPr>
+          <w:sz w:val="28"/>
+          <w:szCs w:val="28"/>
+        </w:rPr>
+        <w:lastRenderedPageBreak/>
+        <w:t xml:space="preserve">Our development street follows the </w:t>
+      </w:r>
+      <w:r>
+        <w:rPr>
+          <w:b/>
+          <w:bCs/>
+          <w:sz w:val="28"/>
+          <w:szCs w:val="28"/>
+        </w:rPr>
+        <w:t>DTAP</w:t>
+      </w:r>
+      <w:r>
+        <w:rPr>
+          <w:sz w:val="28"/>
+          <w:szCs w:val="28"/>
+        </w:rPr>
+        <w:t xml:space="preserve"> cycle: </w:t>
+      </w:r>
+      <w:r>
+        <w:rPr>
+          <w:b/>
+          <w:bCs/>
+          <w:sz w:val="28"/>
+          <w:szCs w:val="28"/>
+        </w:rPr>
+        <w:t>Development</w:t>
+      </w:r>
+      <w:r>
+        <w:rPr>
+          <w:sz w:val="28"/>
+          <w:szCs w:val="28"/>
+        </w:rPr>
+        <w:t xml:space="preserve"> occurs in feature branches, </w:t>
+      </w:r>
+      <w:r>
+        <w:rPr>
+          <w:b/>
+          <w:bCs/>
+          <w:sz w:val="28"/>
+          <w:szCs w:val="28"/>
+        </w:rPr>
+        <w:t>Testing</w:t>
+      </w:r>
+      <w:r>
+        <w:rPr>
+          <w:sz w:val="28"/>
+          <w:szCs w:val="28"/>
+        </w:rPr>
+        <w:t xml:space="preserve"> is automated via Maven, </w:t>
+      </w:r>
+      <w:r>
+        <w:rPr>
+          <w:b/>
+          <w:bCs/>
+          <w:sz w:val="28"/>
+          <w:szCs w:val="28"/>
+        </w:rPr>
+        <w:t>Acceptance</w:t>
+      </w:r>
+      <w:r>
+        <w:rPr>
+          <w:sz w:val="28"/>
+          <w:szCs w:val="28"/>
+        </w:rPr>
+        <w:t xml:space="preserve"> is handled through Pull Request reviews, and </w:t>
+      </w:r>
+      <w:r>
+        <w:rPr>
+          <w:b/>
+          <w:bCs/>
+          <w:sz w:val="28"/>
+          <w:szCs w:val="28"/>
+        </w:rPr>
+        <w:t>Production</w:t>
+      </w:r>
+      <w:r>
+        <w:rPr>
+          <w:sz w:val="28"/>
+          <w:szCs w:val="28"/>
+        </w:rPr>
+        <w:t xml:space="preserve"> is the stable merge to the main branch."</w:t>
+      </w:r>
+    </w:p>
+    <w:p>
+      <w:pPr>
+        <w:rPr>
+          <w:sz w:val="28"/>
+          <w:szCs w:val="28"/>
+        </w:rPr>
+      </w:pPr>
+    </w:p>
+    <w:p>
+      <w:pPr>
         <w:pStyle w:val="Heading1"/>
         <w:numPr>
           <w:ilvl w:val="0"/>
@@ -1609,6 +1591,235 @@
         </w:numPr>
       </w:pPr>
       <w:r>
+        <w:t>SOLID Application</w:t>
+      </w:r>
+    </w:p>
+    <w:tbl>
+      <w:tblPr>
+        <w:tblStyle w:val="TableGrid"/>
+        <w:tblW w:w="0" w:type="auto"/>
+        <w:tblLook w:val="04A0" w:firstRow="1" w:lastRow="0" w:firstColumn="1" w:lastColumn="0" w:noHBand="0" w:noVBand="1"/>
+      </w:tblPr>
+      <w:tblGrid>
+        <w:gridCol w:w="2245"/>
+        <w:gridCol w:w="7105"/>
+      </w:tblGrid>
+      <w:tr>
+        <w:tc>
+          <w:tcPr>
+            <w:tcW w:w="2245" w:type="dxa"/>
+            <w:shd w:val="clear" w:color="auto" w:fill="C1E4F5" w:themeFill="accent1" w:themeFillTint="33"/>
+          </w:tcPr>
+          <w:p>
+            <w:pPr>
+              <w:rPr>
+                <w:b/>
+                <w:bCs/>
+              </w:rPr>
+            </w:pPr>
+            <w:r>
+              <w:rPr>
+                <w:b/>
+                <w:bCs/>
+              </w:rPr>
+              <w:t>Principle</w:t>
+            </w:r>
+          </w:p>
+        </w:tc>
+        <w:tc>
+          <w:tcPr>
+            <w:tcW w:w="7105" w:type="dxa"/>
+            <w:shd w:val="clear" w:color="auto" w:fill="C1E4F5" w:themeFill="accent1" w:themeFillTint="33"/>
+          </w:tcPr>
+          <w:p>
+            <w:pPr>
+              <w:rPr>
+                <w:b/>
+                <w:bCs/>
+              </w:rPr>
+            </w:pPr>
+            <w:r>
+              <w:rPr>
+                <w:b/>
+                <w:bCs/>
+              </w:rPr>
+              <w:t>Application in Jabberpoint</w:t>
+            </w:r>
+          </w:p>
+        </w:tc>
+      </w:tr>
+      <w:tr>
+        <w:tc>
+          <w:tcPr>
+            <w:tcW w:w="2245" w:type="dxa"/>
+            <w:shd w:val="clear" w:color="auto" w:fill="83CAEB" w:themeFill="accent1" w:themeFillTint="66"/>
+          </w:tcPr>
+          <w:p>
+            <w:pPr>
+              <w:tabs>
+                <w:tab w:val="left" w:pos="1152"/>
+              </w:tabs>
+            </w:pPr>
+            <w:r>
+              <w:rPr>
+                <w:b/>
+                <w:bCs/>
+              </w:rPr>
+              <w:t>SRP</w:t>
+            </w:r>
+          </w:p>
+        </w:tc>
+        <w:tc>
+          <w:tcPr>
+            <w:tcW w:w="7105" w:type="dxa"/>
+            <w:shd w:val="clear" w:color="auto" w:fill="83CAEB" w:themeFill="accent1" w:themeFillTint="66"/>
+          </w:tcPr>
+          <w:p>
+            <w:r>
+              <w:t>XMLAccessor no longer creates objects; that responsibility is moved to XMLSlideItemFactory.</w:t>
+            </w:r>
+          </w:p>
+        </w:tc>
+      </w:tr>
+      <w:tr>
+        <w:tc>
+          <w:tcPr>
+            <w:tcW w:w="2245" w:type="dxa"/>
+            <w:shd w:val="clear" w:color="auto" w:fill="C1E4F5" w:themeFill="accent1" w:themeFillTint="33"/>
+          </w:tcPr>
+          <w:p>
+            <w:r>
+              <w:rPr>
+                <w:b/>
+                <w:bCs/>
+              </w:rPr>
+              <w:t>OCP</w:t>
+            </w:r>
+          </w:p>
+        </w:tc>
+        <w:tc>
+          <w:tcPr>
+            <w:tcW w:w="7105" w:type="dxa"/>
+            <w:shd w:val="clear" w:color="auto" w:fill="C1E4F5" w:themeFill="accent1" w:themeFillTint="33"/>
+          </w:tcPr>
+          <w:p>
+            <w:r>
+              <w:t>Adding a new VideoItem only requires a new case in the Factory, not a rewrite of the XMLAccessor.</w:t>
+            </w:r>
+          </w:p>
+        </w:tc>
+      </w:tr>
+      <w:tr>
+        <w:tc>
+          <w:tcPr>
+            <w:tcW w:w="2245" w:type="dxa"/>
+            <w:shd w:val="clear" w:color="auto" w:fill="83CAEB" w:themeFill="accent1" w:themeFillTint="66"/>
+          </w:tcPr>
+          <w:p>
+            <w:r>
+              <w:rPr>
+                <w:b/>
+                <w:bCs/>
+              </w:rPr>
+              <w:t>LSP</w:t>
+            </w:r>
+          </w:p>
+        </w:tc>
+        <w:tc>
+          <w:tcPr>
+            <w:tcW w:w="7105" w:type="dxa"/>
+            <w:shd w:val="clear" w:color="auto" w:fill="83CAEB" w:themeFill="accent1" w:themeFillTint="66"/>
+          </w:tcPr>
+          <w:p>
+            <w:r>
+              <w:t>Presentation can hold a List&lt;SlideItem&gt; and call draw() on any subclass (Text/Bitmap) without knowing the type.</w:t>
+            </w:r>
+          </w:p>
+        </w:tc>
+      </w:tr>
+      <w:tr>
+        <w:tc>
+          <w:tcPr>
+            <w:tcW w:w="2245" w:type="dxa"/>
+            <w:shd w:val="clear" w:color="auto" w:fill="C1E4F5" w:themeFill="accent1" w:themeFillTint="33"/>
+          </w:tcPr>
+          <w:p>
+            <w:r>
+              <w:rPr>
+                <w:b/>
+                <w:bCs/>
+              </w:rPr>
+              <w:t>DIP</w:t>
+            </w:r>
+          </w:p>
+        </w:tc>
+        <w:tc>
+          <w:tcPr>
+            <w:tcW w:w="7105" w:type="dxa"/>
+            <w:shd w:val="clear" w:color="auto" w:fill="C1E4F5" w:themeFill="accent1" w:themeFillTint="33"/>
+          </w:tcPr>
+          <w:p>
+            <w:r>
+              <w:t xml:space="preserve">High-level Presentation no longer depends on low-level SlideViewerComponent thanks to the </w:t>
+            </w:r>
+            <w:r>
+              <w:rPr>
+                <w:b/>
+                <w:bCs/>
+              </w:rPr>
+              <w:t>Observer Interface</w:t>
+            </w:r>
+            <w:r>
+              <w:t>.</w:t>
+            </w:r>
+          </w:p>
+        </w:tc>
+      </w:tr>
+      <w:tr>
+        <w:tc>
+          <w:tcPr>
+            <w:tcW w:w="2245" w:type="dxa"/>
+            <w:shd w:val="clear" w:color="auto" w:fill="83CAEB" w:themeFill="accent1" w:themeFillTint="66"/>
+          </w:tcPr>
+          <w:p>
+            <w:pPr>
+              <w:rPr>
+                <w:b/>
+                <w:bCs/>
+              </w:rPr>
+            </w:pPr>
+            <w:r>
+              <w:rPr>
+                <w:b/>
+                <w:bCs/>
+              </w:rPr>
+              <w:t>ISP</w:t>
+            </w:r>
+          </w:p>
+        </w:tc>
+        <w:tc>
+          <w:tcPr>
+            <w:tcW w:w="7105" w:type="dxa"/>
+            <w:shd w:val="clear" w:color="auto" w:fill="83CAEB" w:themeFill="accent1" w:themeFillTint="66"/>
+          </w:tcPr>
+          <w:p>
+            <w:r>
+              <w:t>Instead of one large interface, we use specific interfaces like PresentationObserver and SlideItemFactory. This ensures classes like SlideViewerComponent only depend on the methods they actually use to update the view.</w:t>
+            </w:r>
+          </w:p>
+        </w:tc>
+      </w:tr>
+    </w:tbl>
+    <w:p/>
+    <w:p>
+      <w:pPr>
+        <w:pStyle w:val="Heading1"/>
+        <w:numPr>
+          <w:ilvl w:val="0"/>
+          <w:numId w:val="9"/>
+        </w:numPr>
+      </w:pPr>
+      <w:r>
         <w:t>Summary</w:t>
       </w:r>
     </w:p>
@@ -1624,23 +1835,7 @@
           <w:sz w:val="28"/>
           <w:szCs w:val="28"/>
         </w:rPr>
-        <w:t xml:space="preserve">By implementing these three patterns and restructuring the project to Maven standards, we transition </w:t>
-      </w:r>
-      <w:proofErr w:type="spellStart"/>
-      <w:r>
-        <w:rPr>
-          <w:sz w:val="28"/>
-          <w:szCs w:val="28"/>
-        </w:rPr>
-        <w:t>JabberPoint</w:t>
-      </w:r>
-      <w:proofErr w:type="spellEnd"/>
-      <w:r>
-        <w:rPr>
-          <w:sz w:val="28"/>
-          <w:szCs w:val="28"/>
-        </w:rPr>
-        <w:t xml:space="preserve"> from a "working" program to a High-Quality Software Product that is maintainable, extensible, and ready for professional deployment.</w:t>
+        <w:t>By implementing these three patterns and restructuring the project to Maven standards, we transition JabberPoint from a "working" program to a High-Quality Software Product that is maintainable, extensible, and ready for professional deployment.</w:t>
       </w:r>
     </w:p>
     <w:sectPr>
@@ -3695,6 +3890,25 @@
       <w:spacing w:val="5"/>
     </w:rPr>
   </w:style>
+  <w:style w:type="table" w:styleId="TableGrid">
+    <w:name w:val="Table Grid"/>
+    <w:basedOn w:val="TableNormal"/>
+    <w:uiPriority w:val="39"/>
+    <w:rsid w:val="002A2738"/>
+    <w:pPr>
+      <w:spacing w:after="0" w:line="240" w:lineRule="auto"/>
+    </w:pPr>
+    <w:tblPr>
+      <w:tblBorders>
+        <w:top w:val="single" w:sz="4" w:space="0" w:color="auto"/>
+        <w:left w:val="single" w:sz="4" w:space="0" w:color="auto"/>
+        <w:bottom w:val="single" w:sz="4" w:space="0" w:color="auto"/>
+        <w:right w:val="single" w:sz="4" w:space="0" w:color="auto"/>
+        <w:insideH w:val="single" w:sz="4" w:space="0" w:color="auto"/>
+        <w:insideV w:val="single" w:sz="4" w:space="0" w:color="auto"/>
+      </w:tblBorders>
+    </w:tblPr>
+  </w:style>
 </w:styles>
 </file>
 

</xml_diff>

<commit_message>
update: edited the patterns
</commit_message>
<xml_diff>
--- a/Documents/Advice Document.docx
+++ b/Documents/Advice Document.docx
@@ -1,6 +1,6 @@
 
 <file path=word/document.xml><?xml version="1.0" encoding="utf-8"?>
-<w:document xmlns:wpc="http://schemas.microsoft.com/office/word/2010/wordprocessingCanvas" xmlns:cx="http://schemas.microsoft.com/office/drawing/2014/chartex" xmlns:cx1="http://schemas.microsoft.com/office/drawing/2015/9/8/chartex" xmlns:cx2="http://schemas.microsoft.com/office/drawing/2015/10/21/chartex" xmlns:cx3="http://schemas.microsoft.com/office/drawing/2016/5/9/chartex" xmlns:cx4="http://schemas.microsoft.com/office/drawing/2016/5/10/chartex" xmlns:cx5="http://schemas.microsoft.com/office/drawing/2016/5/11/chartex" xmlns:cx6="http://schemas.microsoft.com/office/drawing/2016/5/12/chartex" xmlns:cx7="http://schemas.microsoft.com/office/drawing/2016/5/13/chartex" xmlns:cx8="http://schemas.microsoft.com/office/drawing/2016/5/14/chartex" xmlns:mc="http://schemas.openxmlformats.org/markup-compatibility/2006" xmlns:aink="http://schemas.microsoft.com/office/drawing/2016/ink" xmlns:am3d="http://schemas.microsoft.com/office/drawing/2017/model3d" xmlns:o="urn:schemas-microsoft-com:office:office" xmlns:oel="http://schemas.microsoft.com/office/2019/extlst" xmlns:r="http://schemas.openxmlformats.org/officeDocument/2006/relationships" xmlns:m="http://schemas.openxmlformats.org/officeDocument/2006/math" xmlns:v="urn:schemas-microsoft-com:vml" xmlns:wp14="http://schemas.microsoft.com/office/word/2010/wordprocessingDrawing" xmlns:wp="http://schemas.openxmlformats.org/drawingml/2006/wordprocessingDrawing" xmlns:w10="urn:schemas-microsoft-com:office:word" xmlns:w="http://schemas.openxmlformats.org/wordprocessingml/2006/main" xmlns:w14="http://schemas.microsoft.com/office/word/2010/wordml" xmlns:w15="http://schemas.microsoft.com/office/word/2012/wordml" xmlns:w16cex="http://schemas.microsoft.com/office/word/2018/wordml/cex" xmlns:w16cid="http://schemas.microsoft.com/office/word/2016/wordml/cid" xmlns:w16="http://schemas.microsoft.com/office/word/2018/wordml" xmlns:w16du="http://schemas.microsoft.com/office/word/2023/wordml/word16du" xmlns:w16sdtdh="http://schemas.microsoft.com/office/word/2020/wordml/sdtdatahash" xmlns:w16sdtfl="http://schemas.microsoft.com/office/word/2024/wordml/sdtformatlock" xmlns:w16se="http://schemas.microsoft.com/office/word/2015/wordml/symex" xmlns:wpg="http://schemas.microsoft.com/office/word/2010/wordprocessingGroup" xmlns:wpi="http://schemas.microsoft.com/office/word/2010/wordprocessingInk" xmlns:wne="http://schemas.microsoft.com/office/word/2006/wordml" xmlns:wps="http://schemas.microsoft.com/office/word/2010/wordprocessingShape" mc:Ignorable="w14 w15 w16se w16cid w16 w16cex w16sdtdh w16sdtfl w16du wp14">
+<w:document xmlns:wpc="http://schemas.microsoft.com/office/word/2010/wordprocessingCanvas" xmlns:cx="http://schemas.microsoft.com/office/drawing/2014/chartex" xmlns:cx1="http://schemas.microsoft.com/office/drawing/2015/9/8/chartex" xmlns:cx2="http://schemas.microsoft.com/office/drawing/2015/10/21/chartex" xmlns:cx3="http://schemas.microsoft.com/office/drawing/2016/5/9/chartex" xmlns:cx4="http://schemas.microsoft.com/office/drawing/2016/5/10/chartex" xmlns:cx5="http://schemas.microsoft.com/office/drawing/2016/5/11/chartex" xmlns:cx6="http://schemas.microsoft.com/office/drawing/2016/5/12/chartex" xmlns:cx7="http://schemas.microsoft.com/office/drawing/2016/5/13/chartex" xmlns:cx8="http://schemas.microsoft.com/office/drawing/2016/5/14/chartex" xmlns:mc="http://schemas.openxmlformats.org/markup-compatibility/2006" xmlns:aink="http://schemas.microsoft.com/office/drawing/2016/ink" xmlns:am3d="http://schemas.microsoft.com/office/drawing/2017/model3d" xmlns:o="urn:schemas-microsoft-com:office:office" xmlns:r="http://schemas.openxmlformats.org/officeDocument/2006/relationships" xmlns:m="http://schemas.openxmlformats.org/officeDocument/2006/math" xmlns:v="urn:schemas-microsoft-com:vml" xmlns:wp14="http://schemas.microsoft.com/office/word/2010/wordprocessingDrawing" xmlns:wp="http://schemas.openxmlformats.org/drawingml/2006/wordprocessingDrawing" xmlns:w10="urn:schemas-microsoft-com:office:word" xmlns:w="http://schemas.openxmlformats.org/wordprocessingml/2006/main" xmlns:w14="http://schemas.microsoft.com/office/word/2010/wordml" xmlns:w15="http://schemas.microsoft.com/office/word/2012/wordml" xmlns:w16cex="http://schemas.microsoft.com/office/word/2018/wordml/cex" xmlns:w16cid="http://schemas.microsoft.com/office/word/2016/wordml/cid" xmlns:w16="http://schemas.microsoft.com/office/word/2018/wordml" xmlns:w16sdtdh="http://schemas.microsoft.com/office/word/2020/wordml/sdtdatahash" xmlns:w16se="http://schemas.microsoft.com/office/word/2015/wordml/symex" xmlns:wpg="http://schemas.microsoft.com/office/word/2010/wordprocessingGroup" xmlns:wpi="http://schemas.microsoft.com/office/word/2010/wordprocessingInk" xmlns:wne="http://schemas.microsoft.com/office/word/2006/wordml" xmlns:wps="http://schemas.microsoft.com/office/word/2010/wordprocessingShape" mc:Ignorable="w14 w15 w16se w16cid w16 w16cex w16sdtdh wp14">
   <w:body>
     <w:p>
       <w:pPr>
@@ -76,7 +76,7 @@
           <w:sz w:val="28"/>
           <w:szCs w:val="28"/>
         </w:rPr>
-        <w:t xml:space="preserve">Eliza Horváth, </w:t>
+        <w:t xml:space="preserve">Eliza Horváth, Airaa Srinivasan, Sara </w:t>
       </w:r>
       <w:proofErr w:type="spellStart"/>
       <w:r>
@@ -84,7 +84,7 @@
           <w:sz w:val="28"/>
           <w:szCs w:val="28"/>
         </w:rPr>
-        <w:t>Airaa</w:t>
+        <w:t>Kiani</w:t>
       </w:r>
       <w:proofErr w:type="spellEnd"/>
       <w:r>
@@ -92,7 +92,7 @@
           <w:sz w:val="28"/>
           <w:szCs w:val="28"/>
         </w:rPr>
-        <w:t xml:space="preserve"> Srinivasan, Sara Kiani Nejad</w:t>
+        <w:t xml:space="preserve"> Nejad</w:t>
       </w:r>
     </w:p>
     <w:p>
@@ -357,7 +357,15 @@
           <w:sz w:val="28"/>
           <w:szCs w:val="28"/>
         </w:rPr>
-        <w:t xml:space="preserve"> the bin/ folder from the repository. Compiled files will now be automatically generated by Maven in the target/ folder, which is excluded from version control via .</w:t>
+        <w:t xml:space="preserve"> the bin/ folder from the repository. Compiled files will now be automatically generated by Maven in the target/ folder, which is excluded from version control </w:t>
+      </w:r>
+      <w:proofErr w:type="gramStart"/>
+      <w:r>
+        <w:rPr>
+          <w:sz w:val="28"/>
+          <w:szCs w:val="28"/>
+        </w:rPr>
+        <w:t>via .</w:t>
       </w:r>
       <w:proofErr w:type="spellStart"/>
       <w:r>
@@ -368,6 +376,7 @@
         <w:t>gitignore</w:t>
       </w:r>
       <w:proofErr w:type="spellEnd"/>
+      <w:proofErr w:type="gramEnd"/>
       <w:r>
         <w:rPr>
           <w:sz w:val="28"/>
@@ -450,6 +459,8 @@
       <w:proofErr w:type="spellStart"/>
       <w:r>
         <w:rPr>
+          <w:i/>
+          <w:iCs/>
           <w:sz w:val="28"/>
           <w:szCs w:val="28"/>
         </w:rPr>
@@ -461,15 +472,35 @@
           <w:sz w:val="28"/>
           <w:szCs w:val="28"/>
         </w:rPr>
-        <w:t>, the dimensions (1200x800) are hardcoded. These should be moved to a Constants.java or a configuration file.</w:t>
+        <w:t xml:space="preserve">, the dimensions (1200x800) are hardcoded. These should be moved to a </w:t>
+      </w:r>
+      <w:r>
+        <w:rPr>
+          <w:i/>
+          <w:iCs/>
+          <w:sz w:val="28"/>
+          <w:szCs w:val="28"/>
+        </w:rPr>
+        <w:t>Constants.java</w:t>
+      </w:r>
+      <w:r>
+        <w:rPr>
+          <w:sz w:val="28"/>
+          <w:szCs w:val="28"/>
+        </w:rPr>
+        <w:t xml:space="preserve"> or a configuration file.</w:t>
       </w:r>
     </w:p>
     <w:p>
       <w:pPr>
         <w:pStyle w:val="Heading1"/>
-      </w:pPr>
-      <w:r>
-        <w:t>3. Design Patterns</w:t>
+        <w:numPr>
+          <w:ilvl w:val="0"/>
+          <w:numId w:val="2"/>
+        </w:numPr>
+      </w:pPr>
+      <w:r>
+        <w:t>Design Patterns</w:t>
       </w:r>
     </w:p>
     <w:p>
@@ -560,11 +591,31 @@
           <w:szCs w:val="28"/>
           <w:lang w:val="en-US"/>
         </w:rPr>
-        <w:t xml:space="preserve"> The Presentation class is forced to know about the </w:t>
+        <w:t xml:space="preserve"> The </w:t>
+      </w:r>
+      <w:r>
+        <w:rPr>
+          <w:i/>
+          <w:iCs/>
+          <w:sz w:val="28"/>
+          <w:szCs w:val="28"/>
+          <w:lang w:val="en-US"/>
+        </w:rPr>
+        <w:t>Presentation</w:t>
+      </w:r>
+      <w:r>
+        <w:rPr>
+          <w:sz w:val="28"/>
+          <w:szCs w:val="28"/>
+          <w:lang w:val="en-US"/>
+        </w:rPr>
+        <w:t xml:space="preserve"> class is forced to know about the </w:t>
       </w:r>
       <w:proofErr w:type="spellStart"/>
       <w:r>
         <w:rPr>
+          <w:i/>
+          <w:iCs/>
           <w:sz w:val="28"/>
           <w:szCs w:val="28"/>
           <w:lang w:val="en-US"/>
@@ -578,7 +629,25 @@
           <w:szCs w:val="28"/>
           <w:lang w:val="en-US"/>
         </w:rPr>
-        <w:t xml:space="preserve"> to trigger updates. This makes the Model layer dependent on the View layer.</w:t>
+        <w:t xml:space="preserve"> to trigger updates. This makes the Model layer dependent on the </w:t>
+      </w:r>
+      <w:r>
+        <w:rPr>
+          <w:i/>
+          <w:iCs/>
+          <w:sz w:val="28"/>
+          <w:szCs w:val="28"/>
+          <w:lang w:val="en-US"/>
+        </w:rPr>
+        <w:t>View</w:t>
+      </w:r>
+      <w:r>
+        <w:rPr>
+          <w:sz w:val="28"/>
+          <w:szCs w:val="28"/>
+          <w:lang w:val="en-US"/>
+        </w:rPr>
+        <w:t xml:space="preserve"> layer.</w:t>
       </w:r>
     </w:p>
     <w:p>
@@ -639,7 +708,7 @@
           <w:sz w:val="28"/>
           <w:szCs w:val="28"/>
         </w:rPr>
-        <w:t xml:space="preserve">. Presentation becomes the </w:t>
+        <w:t xml:space="preserve">. </w:t>
       </w:r>
       <w:r>
         <w:rPr>
@@ -648,6 +717,22 @@
           <w:sz w:val="28"/>
           <w:szCs w:val="28"/>
         </w:rPr>
+        <w:t>Presentation</w:t>
+      </w:r>
+      <w:r>
+        <w:rPr>
+          <w:sz w:val="28"/>
+          <w:szCs w:val="28"/>
+        </w:rPr>
+        <w:t xml:space="preserve"> becomes the </w:t>
+      </w:r>
+      <w:r>
+        <w:rPr>
+          <w:i/>
+          <w:iCs/>
+          <w:sz w:val="28"/>
+          <w:szCs w:val="28"/>
+        </w:rPr>
         <w:t>Subject</w:t>
       </w:r>
       <w:r>
@@ -660,6 +745,8 @@
       <w:proofErr w:type="spellStart"/>
       <w:r>
         <w:rPr>
+          <w:i/>
+          <w:iCs/>
           <w:sz w:val="28"/>
           <w:szCs w:val="28"/>
         </w:rPr>
@@ -717,7 +804,23 @@
           <w:sz w:val="28"/>
           <w:szCs w:val="28"/>
         </w:rPr>
-        <w:t xml:space="preserve"> This is the most effective way to achieve Dependency Inversion (DIP). It allows us to add new views (like a mobile view or a print preview) without ever changing the core Presentation logic.</w:t>
+        <w:t xml:space="preserve"> This is the most effective way to achieve Dependency Inversion (DIP). It allows us to add new views (like a mobile view or a print preview) without ever changing the core </w:t>
+      </w:r>
+      <w:r>
+        <w:rPr>
+          <w:i/>
+          <w:iCs/>
+          <w:sz w:val="28"/>
+          <w:szCs w:val="28"/>
+        </w:rPr>
+        <w:t>Presentation</w:t>
+      </w:r>
+      <w:r>
+        <w:rPr>
+          <w:sz w:val="28"/>
+          <w:szCs w:val="28"/>
+        </w:rPr>
+        <w:t xml:space="preserve"> logic.</w:t>
       </w:r>
     </w:p>
     <w:p>
@@ -740,14 +843,16 @@
           <w:sz w:val="28"/>
           <w:szCs w:val="28"/>
         </w:rPr>
-        <w:t>Why not Command?</w:t>
-      </w:r>
-      <w:r>
-        <w:rPr>
-          <w:sz w:val="28"/>
-          <w:szCs w:val="28"/>
-        </w:rPr>
-        <w:t xml:space="preserve"> The Command pattern is great for Undo/Redo</w:t>
+        <w:t xml:space="preserve">Why not </w:t>
+      </w:r>
+      <w:r>
+        <w:rPr>
+          <w:b/>
+          <w:bCs/>
+          <w:sz w:val="28"/>
+          <w:szCs w:val="28"/>
+        </w:rPr>
+        <w:t>Mediator?</w:t>
       </w:r>
       <w:r>
         <w:rPr>
@@ -761,49 +866,73 @@
           <w:sz w:val="28"/>
           <w:szCs w:val="28"/>
         </w:rPr>
-        <w:t xml:space="preserve">functionality. However, </w:t>
-      </w:r>
-      <w:r>
-        <w:rPr>
-          <w:sz w:val="28"/>
-          <w:szCs w:val="28"/>
-        </w:rPr>
-        <w:t>the</w:t>
-      </w:r>
-      <w:r>
-        <w:rPr>
-          <w:sz w:val="28"/>
-          <w:szCs w:val="28"/>
-        </w:rPr>
-        <w:t xml:space="preserve"> biggest problem isn't the lack of Undo; it's the fact that the Model and View are tangled.</w:t>
-      </w:r>
-      <w:r>
-        <w:rPr>
-          <w:sz w:val="28"/>
-          <w:szCs w:val="28"/>
-        </w:rPr>
-        <w:t xml:space="preserve"> We</w:t>
-      </w:r>
-      <w:r>
-        <w:rPr>
-          <w:sz w:val="28"/>
-          <w:szCs w:val="28"/>
-        </w:rPr>
-        <w:t xml:space="preserve"> must fix the coupling (Observer) before </w:t>
-      </w:r>
-      <w:r>
-        <w:rPr>
-          <w:sz w:val="28"/>
-          <w:szCs w:val="28"/>
-        </w:rPr>
-        <w:t>we</w:t>
-      </w:r>
-      <w:r>
-        <w:rPr>
-          <w:sz w:val="28"/>
-          <w:szCs w:val="28"/>
-        </w:rPr>
-        <w:t xml:space="preserve"> can add complex features like Command.</w:t>
+        <w:t xml:space="preserve">Since it also decouples components that must communicate, the Mediator pattern was taken into consideration as an alternative. Nevertheless, the Mediator style adds needless complexity by introducing a central coordination object that all components need to be aware of. </w:t>
+      </w:r>
+      <w:proofErr w:type="spellStart"/>
+      <w:r>
+        <w:rPr>
+          <w:sz w:val="28"/>
+          <w:szCs w:val="28"/>
+        </w:rPr>
+        <w:t>JabberPoint</w:t>
+      </w:r>
+      <w:proofErr w:type="spellEnd"/>
+      <w:r>
+        <w:rPr>
+          <w:sz w:val="28"/>
+          <w:szCs w:val="28"/>
+        </w:rPr>
+        <w:t xml:space="preserve"> communication is one-way; the view just needs to be informed when the current slide changes. The MVC violation found in the analysis is directly resolved by the Observer design, which is more suitable since it permits </w:t>
+      </w:r>
+      <w:r>
+        <w:rPr>
+          <w:i/>
+          <w:iCs/>
+          <w:sz w:val="28"/>
+          <w:szCs w:val="28"/>
+        </w:rPr>
+        <w:t>Presentation</w:t>
+      </w:r>
+      <w:r>
+        <w:rPr>
+          <w:sz w:val="28"/>
+          <w:szCs w:val="28"/>
+        </w:rPr>
+        <w:t xml:space="preserve"> to stay totally ignorant of the view layer. Future view additions just need to implement </w:t>
+      </w:r>
+      <w:proofErr w:type="spellStart"/>
+      <w:r>
+        <w:rPr>
+          <w:i/>
+          <w:iCs/>
+          <w:sz w:val="28"/>
+          <w:szCs w:val="28"/>
+        </w:rPr>
+        <w:t>PresentationObserver</w:t>
+      </w:r>
+      <w:proofErr w:type="spellEnd"/>
+      <w:r>
+        <w:rPr>
+          <w:sz w:val="28"/>
+          <w:szCs w:val="28"/>
+        </w:rPr>
+        <w:t xml:space="preserve">; </w:t>
+      </w:r>
+      <w:r>
+        <w:rPr>
+          <w:i/>
+          <w:iCs/>
+          <w:sz w:val="28"/>
+          <w:szCs w:val="28"/>
+        </w:rPr>
+        <w:t>Presentation</w:t>
+      </w:r>
+      <w:r>
+        <w:rPr>
+          <w:sz w:val="28"/>
+          <w:szCs w:val="28"/>
+        </w:rPr>
+        <w:t xml:space="preserve"> itself doesn't need to be changed in any way.</w:t>
       </w:r>
     </w:p>
     <w:p>
@@ -830,7 +959,16 @@
           <w:sz w:val="28"/>
           <w:szCs w:val="28"/>
         </w:rPr>
-        <w:t xml:space="preserve">Pattern 2: The Abstract Factory Pattern </w:t>
+        <w:t xml:space="preserve">Pattern 2: The Abstract Factory </w:t>
+      </w:r>
+      <w:r>
+        <w:rPr>
+          <w:b/>
+          <w:bCs/>
+          <w:sz w:val="28"/>
+          <w:szCs w:val="28"/>
+        </w:rPr>
+        <w:t xml:space="preserve">Pattern </w:t>
       </w:r>
       <w:r>
         <w:rPr>
@@ -872,6 +1010,8 @@
       <w:proofErr w:type="spellStart"/>
       <w:r>
         <w:rPr>
+          <w:i/>
+          <w:iCs/>
           <w:sz w:val="28"/>
           <w:szCs w:val="28"/>
         </w:rPr>
@@ -946,6 +1086,8 @@
       <w:proofErr w:type="spellStart"/>
       <w:r>
         <w:rPr>
+          <w:i/>
+          <w:iCs/>
           <w:sz w:val="28"/>
           <w:szCs w:val="28"/>
         </w:rPr>
@@ -987,7 +1129,48 @@
           <w:sz w:val="28"/>
           <w:szCs w:val="28"/>
         </w:rPr>
-        <w:t xml:space="preserve"> By delegating object creation to a factory, the XML parser only needs to know what to create, not how to create it. This </w:t>
+        <w:t xml:space="preserve"> </w:t>
+      </w:r>
+      <w:r>
+        <w:rPr>
+          <w:sz w:val="28"/>
+          <w:szCs w:val="28"/>
+        </w:rPr>
+        <w:t xml:space="preserve">By delegating object creation to a factory, the </w:t>
+      </w:r>
+      <w:r>
+        <w:rPr>
+          <w:i/>
+          <w:iCs/>
+          <w:sz w:val="28"/>
+          <w:szCs w:val="28"/>
+        </w:rPr>
+        <w:t>XML</w:t>
+      </w:r>
+      <w:r>
+        <w:rPr>
+          <w:sz w:val="28"/>
+          <w:szCs w:val="28"/>
+        </w:rPr>
+        <w:t xml:space="preserve"> parser only needs to know what to create, not how to create it. This makes the system highly extensible for future media types (e.g., </w:t>
+      </w:r>
+      <w:proofErr w:type="spellStart"/>
+      <w:r>
+        <w:rPr>
+          <w:i/>
+          <w:iCs/>
+          <w:sz w:val="28"/>
+          <w:szCs w:val="28"/>
+        </w:rPr>
+        <w:t>VideoItem</w:t>
+      </w:r>
+      <w:proofErr w:type="spellEnd"/>
+      <w:r>
+        <w:rPr>
+          <w:sz w:val="28"/>
+          <w:szCs w:val="28"/>
+        </w:rPr>
+        <w:t>).</w:t>
       </w:r>
     </w:p>
     <w:p>
@@ -1005,57 +1188,69 @@
       </w:pPr>
       <w:r>
         <w:rPr>
-          <w:sz w:val="28"/>
-          <w:szCs w:val="28"/>
-        </w:rPr>
-        <w:t xml:space="preserve">makes the system highly extensible for future media types (e.g., </w:t>
-      </w:r>
-      <w:proofErr w:type="spellStart"/>
-      <w:r>
-        <w:rPr>
-          <w:sz w:val="28"/>
-          <w:szCs w:val="28"/>
-        </w:rPr>
-        <w:t>VideoItem</w:t>
-      </w:r>
-      <w:proofErr w:type="spellEnd"/>
-      <w:r>
-        <w:rPr>
-          <w:sz w:val="28"/>
-          <w:szCs w:val="28"/>
-        </w:rPr>
-        <w:t>).</w:t>
-      </w:r>
-    </w:p>
-    <w:p>
-      <w:pPr>
-        <w:pStyle w:val="ListParagraph"/>
-        <w:numPr>
-          <w:ilvl w:val="0"/>
-          <w:numId w:val="6"/>
-        </w:numPr>
-        <w:spacing w:after="0"/>
-        <w:rPr>
-          <w:sz w:val="28"/>
-          <w:szCs w:val="28"/>
-        </w:rPr>
-      </w:pPr>
-      <w:r>
-        <w:rPr>
           <w:b/>
           <w:bCs/>
           <w:sz w:val="28"/>
           <w:szCs w:val="28"/>
         </w:rPr>
-        <w:t>Why not Decorator?</w:t>
-      </w:r>
-      <w:r>
-        <w:rPr>
-          <w:sz w:val="28"/>
-          <w:szCs w:val="28"/>
-        </w:rPr>
-        <w:t xml:space="preserve"> The Decorator pattern is used to add </w:t>
-      </w:r>
+        <w:t xml:space="preserve">Why not </w:t>
+      </w:r>
+      <w:r>
+        <w:rPr>
+          <w:b/>
+          <w:bCs/>
+          <w:sz w:val="28"/>
+          <w:szCs w:val="28"/>
+        </w:rPr>
+        <w:t>Factory Method</w:t>
+      </w:r>
+      <w:r>
+        <w:rPr>
+          <w:b/>
+          <w:bCs/>
+          <w:sz w:val="28"/>
+          <w:szCs w:val="28"/>
+        </w:rPr>
+        <w:t>?</w:t>
+      </w:r>
+      <w:r>
+        <w:rPr>
+          <w:sz w:val="28"/>
+          <w:szCs w:val="28"/>
+        </w:rPr>
+        <w:t xml:space="preserve"> </w:t>
+      </w:r>
+      <w:r>
+        <w:rPr>
+          <w:sz w:val="28"/>
+          <w:szCs w:val="28"/>
+        </w:rPr>
+        <w:t xml:space="preserve">Given that it similarly manages object generation without defining the precise class, the Factory Method pattern was taken into consideration as an alternative. However, </w:t>
+      </w:r>
+      <w:proofErr w:type="spellStart"/>
+      <w:r>
+        <w:rPr>
+          <w:sz w:val="28"/>
+          <w:szCs w:val="28"/>
+        </w:rPr>
+        <w:t>JabberPoint</w:t>
+      </w:r>
+      <w:proofErr w:type="spellEnd"/>
+      <w:r>
+        <w:rPr>
+          <w:sz w:val="28"/>
+          <w:szCs w:val="28"/>
+        </w:rPr>
+        <w:t xml:space="preserve"> must build several related sorts of slide items, such </w:t>
+      </w:r>
+      <w:r>
+        <w:rPr>
+          <w:sz w:val="28"/>
+          <w:szCs w:val="28"/>
+        </w:rPr>
+        <w:t xml:space="preserve">as </w:t>
+      </w:r>
+      <w:proofErr w:type="spellStart"/>
       <w:r>
         <w:rPr>
           <w:i/>
@@ -1063,36 +1258,25 @@
           <w:sz w:val="28"/>
           <w:szCs w:val="28"/>
         </w:rPr>
-        <w:t>extra</w:t>
-      </w:r>
-      <w:r>
-        <w:rPr>
-          <w:sz w:val="28"/>
-          <w:szCs w:val="28"/>
-        </w:rPr>
-        <w:t xml:space="preserve"> responsibilities to an object</w:t>
-      </w:r>
-      <w:r>
-        <w:rPr>
-          <w:sz w:val="28"/>
-          <w:szCs w:val="28"/>
-        </w:rPr>
-        <w:t xml:space="preserve">. </w:t>
-      </w:r>
-      <w:r>
-        <w:rPr>
-          <w:sz w:val="28"/>
-          <w:szCs w:val="28"/>
-        </w:rPr>
-        <w:t xml:space="preserve">In </w:t>
+        <w:t>TextItem</w:t>
+      </w:r>
+      <w:proofErr w:type="spellEnd"/>
+      <w:r>
+        <w:rPr>
+          <w:sz w:val="28"/>
+          <w:szCs w:val="28"/>
+        </w:rPr>
+        <w:t xml:space="preserve"> and </w:t>
       </w:r>
       <w:proofErr w:type="spellStart"/>
       <w:r>
         <w:rPr>
-          <w:sz w:val="28"/>
-          <w:szCs w:val="28"/>
-        </w:rPr>
-        <w:t>JabberPoint</w:t>
+          <w:i/>
+          <w:iCs/>
+          <w:sz w:val="28"/>
+          <w:szCs w:val="28"/>
+        </w:rPr>
+        <w:t>BitmapItem</w:t>
       </w:r>
       <w:proofErr w:type="spellEnd"/>
       <w:r>
@@ -1100,49 +1284,58 @@
           <w:sz w:val="28"/>
           <w:szCs w:val="28"/>
         </w:rPr>
-        <w:t>, we aren't trying to "wrap" items</w:t>
-      </w:r>
-      <w:r>
-        <w:rPr>
-          <w:sz w:val="28"/>
-          <w:szCs w:val="28"/>
-        </w:rPr>
-        <w:t xml:space="preserve">, </w:t>
-      </w:r>
-      <w:r>
-        <w:rPr>
-          <w:sz w:val="28"/>
-          <w:szCs w:val="28"/>
-        </w:rPr>
-        <w:t xml:space="preserve">we are trying to create them cleanly. The Factory solves the </w:t>
-      </w:r>
-      <w:r>
-        <w:rPr>
-          <w:sz w:val="28"/>
-          <w:szCs w:val="28"/>
-        </w:rPr>
-        <w:t>creation</w:t>
-      </w:r>
-      <w:r>
-        <w:rPr>
-          <w:sz w:val="28"/>
-          <w:szCs w:val="28"/>
-        </w:rPr>
-        <w:t xml:space="preserve"> problem, which is more urgent than the </w:t>
-      </w:r>
-      <w:r>
-        <w:rPr>
-          <w:sz w:val="28"/>
-          <w:szCs w:val="28"/>
-        </w:rPr>
-        <w:t>decoration</w:t>
-      </w:r>
-      <w:r>
-        <w:rPr>
-          <w:sz w:val="28"/>
-          <w:szCs w:val="28"/>
-        </w:rPr>
-        <w:t xml:space="preserve"> problem.</w:t>
+        <w:t xml:space="preserve">, but the Factory Method is intended to create a single type of object through subclassing. Because it unifies the generation of various related objects under a single interface, </w:t>
+      </w:r>
+      <w:proofErr w:type="spellStart"/>
+      <w:r>
+        <w:rPr>
+          <w:i/>
+          <w:iCs/>
+          <w:sz w:val="28"/>
+          <w:szCs w:val="28"/>
+        </w:rPr>
+        <w:t>SlideItemFactory</w:t>
+      </w:r>
+      <w:proofErr w:type="spellEnd"/>
+      <w:r>
+        <w:rPr>
+          <w:sz w:val="28"/>
+          <w:szCs w:val="28"/>
+        </w:rPr>
+        <w:t xml:space="preserve">, the Abstract Factory pattern is more suitable. This keeps the system open for extension and closed for </w:t>
+      </w:r>
+      <w:r>
+        <w:rPr>
+          <w:sz w:val="28"/>
+          <w:szCs w:val="28"/>
+        </w:rPr>
+        <w:lastRenderedPageBreak/>
+        <w:t xml:space="preserve">modification, so if a new item type, like </w:t>
+      </w:r>
+      <w:proofErr w:type="spellStart"/>
+      <w:r>
+        <w:rPr>
+          <w:i/>
+          <w:iCs/>
+          <w:sz w:val="28"/>
+          <w:szCs w:val="28"/>
+        </w:rPr>
+        <w:t>VideoItem</w:t>
+      </w:r>
+      <w:proofErr w:type="spellEnd"/>
+      <w:r>
+        <w:rPr>
+          <w:sz w:val="28"/>
+          <w:szCs w:val="28"/>
+        </w:rPr>
+        <w:t>, is added in the future, only a new factory implementation needs to be added without changing the current code</w:t>
+      </w:r>
+      <w:r>
+        <w:rPr>
+          <w:sz w:val="28"/>
+          <w:szCs w:val="28"/>
+        </w:rPr>
+        <w:t>.</w:t>
       </w:r>
     </w:p>
     <w:p>
@@ -1213,7 +1406,23 @@
           <w:sz w:val="28"/>
           <w:szCs w:val="28"/>
         </w:rPr>
-        <w:t>The current Style class uses static arrays and "Magic Numbers" to manage fonts and colours. Static variables are hard to mock during Automated Testing</w:t>
+        <w:t xml:space="preserve">The current </w:t>
+      </w:r>
+      <w:r>
+        <w:rPr>
+          <w:i/>
+          <w:iCs/>
+          <w:sz w:val="28"/>
+          <w:szCs w:val="28"/>
+        </w:rPr>
+        <w:t>Style</w:t>
+      </w:r>
+      <w:r>
+        <w:rPr>
+          <w:sz w:val="28"/>
+          <w:szCs w:val="28"/>
+        </w:rPr>
+        <w:t xml:space="preserve"> class uses static arrays and "Magic Numbers" to manage fonts and colours. Static variables are hard to mock during Automated Testing</w:t>
       </w:r>
       <w:r>
         <w:rPr>
@@ -1275,6 +1484,8 @@
       </w:r>
       <w:r>
         <w:rPr>
+          <w:i/>
+          <w:iCs/>
           <w:sz w:val="28"/>
           <w:szCs w:val="28"/>
         </w:rPr>
@@ -1282,6 +1493,8 @@
       </w:r>
       <w:r>
         <w:rPr>
+          <w:i/>
+          <w:iCs/>
           <w:sz w:val="28"/>
           <w:szCs w:val="28"/>
         </w:rPr>
@@ -1289,6 +1502,8 @@
       </w:r>
       <w:r>
         <w:rPr>
+          <w:i/>
+          <w:iCs/>
           <w:sz w:val="28"/>
           <w:szCs w:val="28"/>
         </w:rPr>
@@ -1329,15 +1544,7 @@
           <w:sz w:val="28"/>
           <w:szCs w:val="28"/>
         </w:rPr>
-        <w:t xml:space="preserve"> A Singleton ensures a single "Source of Truth" for the application's appearance. It provides a global access point while </w:t>
-      </w:r>
-      <w:r>
-        <w:rPr>
-          <w:sz w:val="28"/>
-          <w:szCs w:val="28"/>
-        </w:rPr>
-        <w:lastRenderedPageBreak/>
-        <w:t>allowing us to implement the "Lazy Initialization" shown in the lecture slides, improving memory efficiency.</w:t>
+        <w:t xml:space="preserve"> A Singleton ensures a single "Source of Truth" for the application's appearance. It provides a global access point while allowing us to implement the "Lazy Initialization" shown in the lecture slides, improving memory efficiency.</w:t>
       </w:r>
     </w:p>
     <w:p>
@@ -1360,58 +1567,25 @@
           <w:sz w:val="28"/>
           <w:szCs w:val="28"/>
         </w:rPr>
-        <w:t>Why not Adapter?</w:t>
-      </w:r>
-      <w:r>
-        <w:rPr>
-          <w:sz w:val="28"/>
-          <w:szCs w:val="28"/>
-        </w:rPr>
-        <w:t xml:space="preserve"> The Adapter pattern is used to make two different interfaces work together</w:t>
-      </w:r>
-      <w:r>
-        <w:rPr>
-          <w:sz w:val="28"/>
-          <w:szCs w:val="28"/>
-        </w:rPr>
-        <w:t xml:space="preserve">. </w:t>
-      </w:r>
-      <w:r>
-        <w:rPr>
-          <w:sz w:val="28"/>
-          <w:szCs w:val="28"/>
-        </w:rPr>
-        <w:t xml:space="preserve">In </w:t>
-      </w:r>
-      <w:proofErr w:type="spellStart"/>
-      <w:r>
-        <w:rPr>
-          <w:sz w:val="28"/>
-          <w:szCs w:val="28"/>
-        </w:rPr>
-        <w:t>JabberPoint</w:t>
-      </w:r>
-      <w:proofErr w:type="spellEnd"/>
-      <w:r>
-        <w:rPr>
-          <w:sz w:val="28"/>
-          <w:szCs w:val="28"/>
-        </w:rPr>
-        <w:t xml:space="preserve">, all the code is </w:t>
-      </w:r>
-      <w:r>
-        <w:rPr>
-          <w:sz w:val="28"/>
-          <w:szCs w:val="28"/>
-        </w:rPr>
-        <w:t xml:space="preserve">ours, we </w:t>
-      </w:r>
-      <w:r>
-        <w:rPr>
-          <w:sz w:val="28"/>
-          <w:szCs w:val="28"/>
-        </w:rPr>
-        <w:t>don't have incompatible</w:t>
+        <w:t xml:space="preserve">Why not </w:t>
+      </w:r>
+      <w:r>
+        <w:rPr>
+          <w:b/>
+          <w:bCs/>
+          <w:sz w:val="28"/>
+          <w:szCs w:val="28"/>
+        </w:rPr>
+        <w:t>static utility class</w:t>
+      </w:r>
+      <w:r>
+        <w:rPr>
+          <w:b/>
+          <w:bCs/>
+          <w:sz w:val="28"/>
+          <w:szCs w:val="28"/>
+        </w:rPr>
+        <w:t>?</w:t>
       </w:r>
       <w:r>
         <w:rPr>
@@ -1425,35 +1599,35 @@
           <w:sz w:val="28"/>
           <w:szCs w:val="28"/>
         </w:rPr>
-        <w:t xml:space="preserve">interfaces yet. </w:t>
-      </w:r>
-      <w:r>
-        <w:rPr>
-          <w:sz w:val="28"/>
-          <w:szCs w:val="28"/>
-        </w:rPr>
-        <w:t>We</w:t>
-      </w:r>
-      <w:r>
-        <w:rPr>
-          <w:sz w:val="28"/>
-          <w:szCs w:val="28"/>
-        </w:rPr>
-        <w:t xml:space="preserve"> have a </w:t>
-      </w:r>
-      <w:r>
-        <w:rPr>
-          <w:sz w:val="28"/>
-          <w:szCs w:val="28"/>
-        </w:rPr>
-        <w:t>global state</w:t>
-      </w:r>
-      <w:r>
-        <w:rPr>
-          <w:sz w:val="28"/>
-          <w:szCs w:val="28"/>
-        </w:rPr>
-        <w:t xml:space="preserve"> problem, which is what Singleton addresses.</w:t>
+        <w:t xml:space="preserve">Considering it also offers global access to shared styling data, a static utility class was taken into consideration as an option. However, static classes are far more difficult to mock during unit testing and cannot be lazily initialized, which reduces their memory efficiency. Because it offers a single controlled instance of Style that is only created when </w:t>
+      </w:r>
+      <w:r>
+        <w:rPr>
+          <w:sz w:val="28"/>
+          <w:szCs w:val="28"/>
+        </w:rPr>
+        <w:t>first needed</w:t>
+      </w:r>
+      <w:r>
+        <w:rPr>
+          <w:sz w:val="28"/>
+          <w:szCs w:val="28"/>
+        </w:rPr>
+        <w:t xml:space="preserve">, the Singleton approach is better suitable. This eliminates the discrepancies that existed in the initial approach and guarantees that there is a single, reliable source of truth for the application's appearance, making the </w:t>
+      </w:r>
+      <w:r>
+        <w:rPr>
+          <w:sz w:val="28"/>
+          <w:szCs w:val="28"/>
+        </w:rPr>
+        <w:t>styling</w:t>
+      </w:r>
+      <w:r>
+        <w:rPr>
+          <w:sz w:val="28"/>
+          <w:szCs w:val="28"/>
+        </w:rPr>
+        <w:t xml:space="preserve"> configuration simpler to test.</w:t>
       </w:r>
     </w:p>
     <w:p>
@@ -1461,7 +1635,7 @@
         <w:pStyle w:val="Heading1"/>
         <w:numPr>
           <w:ilvl w:val="0"/>
-          <w:numId w:val="9"/>
+          <w:numId w:val="2"/>
         </w:numPr>
       </w:pPr>
       <w:r>
@@ -1590,6 +1764,7 @@
           <w:sz w:val="28"/>
           <w:szCs w:val="28"/>
         </w:rPr>
+        <w:lastRenderedPageBreak/>
         <w:t>Acceptance:</w:t>
       </w:r>
       <w:r>
@@ -1605,7 +1780,7 @@
         <w:pStyle w:val="Heading1"/>
         <w:numPr>
           <w:ilvl w:val="0"/>
-          <w:numId w:val="9"/>
+          <w:numId w:val="2"/>
         </w:numPr>
       </w:pPr>
       <w:r>
@@ -1614,36 +1789,23 @@
     </w:p>
     <w:p>
       <w:pPr>
-        <w:rPr>
-          <w:sz w:val="28"/>
-          <w:szCs w:val="28"/>
-        </w:rPr>
-      </w:pPr>
-      <w:r>
-        <w:rPr>
-          <w:sz w:val="28"/>
-          <w:szCs w:val="28"/>
-        </w:rPr>
+        <w:pStyle w:val="BodyText"/>
+      </w:pPr>
+      <w:r>
         <w:t xml:space="preserve">By implementing these three patterns and restructuring the project to Maven standards, we transition </w:t>
       </w:r>
       <w:proofErr w:type="spellStart"/>
       <w:r>
-        <w:rPr>
-          <w:sz w:val="28"/>
-          <w:szCs w:val="28"/>
-        </w:rPr>
         <w:t>JabberPoint</w:t>
       </w:r>
       <w:proofErr w:type="spellEnd"/>
       <w:r>
-        <w:rPr>
-          <w:sz w:val="28"/>
-          <w:szCs w:val="28"/>
-        </w:rPr>
         <w:t xml:space="preserve"> from a "working" program to a High-Quality Software Product that is maintainable, extensible, and ready for professional deployment.</w:t>
       </w:r>
     </w:p>
     <w:sectPr>
+      <w:headerReference w:type="default" r:id="rId7"/>
+      <w:footerReference w:type="default" r:id="rId8"/>
       <w:pgSz w:w="12240" w:h="15840"/>
       <w:pgMar w:top="1440" w:right="1440" w:bottom="1440" w:left="1440" w:header="720" w:footer="720" w:gutter="0"/>
       <w:cols w:space="720"/>
@@ -1653,8 +1815,147 @@
 </w:document>
 </file>
 
+<file path=word/endnotes.xml><?xml version="1.0" encoding="utf-8"?>
+<w:endnotes xmlns:wpc="http://schemas.microsoft.com/office/word/2010/wordprocessingCanvas" xmlns:cx="http://schemas.microsoft.com/office/drawing/2014/chartex" xmlns:cx1="http://schemas.microsoft.com/office/drawing/2015/9/8/chartex" xmlns:cx2="http://schemas.microsoft.com/office/drawing/2015/10/21/chartex" xmlns:cx3="http://schemas.microsoft.com/office/drawing/2016/5/9/chartex" xmlns:cx4="http://schemas.microsoft.com/office/drawing/2016/5/10/chartex" xmlns:cx5="http://schemas.microsoft.com/office/drawing/2016/5/11/chartex" xmlns:cx6="http://schemas.microsoft.com/office/drawing/2016/5/12/chartex" xmlns:cx7="http://schemas.microsoft.com/office/drawing/2016/5/13/chartex" xmlns:cx8="http://schemas.microsoft.com/office/drawing/2016/5/14/chartex" xmlns:mc="http://schemas.openxmlformats.org/markup-compatibility/2006" xmlns:aink="http://schemas.microsoft.com/office/drawing/2016/ink" xmlns:am3d="http://schemas.microsoft.com/office/drawing/2017/model3d" xmlns:o="urn:schemas-microsoft-com:office:office" xmlns:r="http://schemas.openxmlformats.org/officeDocument/2006/relationships" xmlns:m="http://schemas.openxmlformats.org/officeDocument/2006/math" xmlns:v="urn:schemas-microsoft-com:vml" xmlns:wp14="http://schemas.microsoft.com/office/word/2010/wordprocessingDrawing" xmlns:wp="http://schemas.openxmlformats.org/drawingml/2006/wordprocessingDrawing" xmlns:w10="urn:schemas-microsoft-com:office:word" xmlns:w="http://schemas.openxmlformats.org/wordprocessingml/2006/main" xmlns:w14="http://schemas.microsoft.com/office/word/2010/wordml" xmlns:w15="http://schemas.microsoft.com/office/word/2012/wordml" xmlns:w16cex="http://schemas.microsoft.com/office/word/2018/wordml/cex" xmlns:w16cid="http://schemas.microsoft.com/office/word/2016/wordml/cid" xmlns:w16="http://schemas.microsoft.com/office/word/2018/wordml" xmlns:w16sdtdh="http://schemas.microsoft.com/office/word/2020/wordml/sdtdatahash" xmlns:w16se="http://schemas.microsoft.com/office/word/2015/wordml/symex" xmlns:wpg="http://schemas.microsoft.com/office/word/2010/wordprocessingGroup" xmlns:wpi="http://schemas.microsoft.com/office/word/2010/wordprocessingInk" xmlns:wne="http://schemas.microsoft.com/office/word/2006/wordml" xmlns:wps="http://schemas.microsoft.com/office/word/2010/wordprocessingShape" mc:Ignorable="w14 w15 w16se w16cid w16 w16cex w16sdtdh wp14">
+  <w:endnote w:type="separator" w:id="-1">
+    <w:p>
+      <w:pPr>
+        <w:spacing w:after="0" w:line="240" w:lineRule="auto"/>
+      </w:pPr>
+      <w:r>
+        <w:separator/>
+      </w:r>
+    </w:p>
+  </w:endnote>
+  <w:endnote w:type="continuationSeparator" w:id="0">
+    <w:p>
+      <w:pPr>
+        <w:spacing w:after="0" w:line="240" w:lineRule="auto"/>
+      </w:pPr>
+      <w:r>
+        <w:continuationSeparator/>
+      </w:r>
+    </w:p>
+  </w:endnote>
+</w:endnotes>
+</file>
+
+<file path=word/footer1.xml><?xml version="1.0" encoding="utf-8"?>
+<w:ftr xmlns:wpc="http://schemas.microsoft.com/office/word/2010/wordprocessingCanvas" xmlns:cx="http://schemas.microsoft.com/office/drawing/2014/chartex" xmlns:cx1="http://schemas.microsoft.com/office/drawing/2015/9/8/chartex" xmlns:cx2="http://schemas.microsoft.com/office/drawing/2015/10/21/chartex" xmlns:cx3="http://schemas.microsoft.com/office/drawing/2016/5/9/chartex" xmlns:cx4="http://schemas.microsoft.com/office/drawing/2016/5/10/chartex" xmlns:cx5="http://schemas.microsoft.com/office/drawing/2016/5/11/chartex" xmlns:cx6="http://schemas.microsoft.com/office/drawing/2016/5/12/chartex" xmlns:cx7="http://schemas.microsoft.com/office/drawing/2016/5/13/chartex" xmlns:cx8="http://schemas.microsoft.com/office/drawing/2016/5/14/chartex" xmlns:mc="http://schemas.openxmlformats.org/markup-compatibility/2006" xmlns:aink="http://schemas.microsoft.com/office/drawing/2016/ink" xmlns:am3d="http://schemas.microsoft.com/office/drawing/2017/model3d" xmlns:o="urn:schemas-microsoft-com:office:office" xmlns:r="http://schemas.openxmlformats.org/officeDocument/2006/relationships" xmlns:m="http://schemas.openxmlformats.org/officeDocument/2006/math" xmlns:v="urn:schemas-microsoft-com:vml" xmlns:wp14="http://schemas.microsoft.com/office/word/2010/wordprocessingDrawing" xmlns:wp="http://schemas.openxmlformats.org/drawingml/2006/wordprocessingDrawing" xmlns:w10="urn:schemas-microsoft-com:office:word" xmlns:w="http://schemas.openxmlformats.org/wordprocessingml/2006/main" xmlns:w14="http://schemas.microsoft.com/office/word/2010/wordml" xmlns:w15="http://schemas.microsoft.com/office/word/2012/wordml" xmlns:w16cex="http://schemas.microsoft.com/office/word/2018/wordml/cex" xmlns:w16cid="http://schemas.microsoft.com/office/word/2016/wordml/cid" xmlns:w16="http://schemas.microsoft.com/office/word/2018/wordml" xmlns:w16sdtdh="http://schemas.microsoft.com/office/word/2020/wordml/sdtdatahash" xmlns:w16se="http://schemas.microsoft.com/office/word/2015/wordml/symex" xmlns:wpg="http://schemas.microsoft.com/office/word/2010/wordprocessingGroup" xmlns:wpi="http://schemas.microsoft.com/office/word/2010/wordprocessingInk" xmlns:wne="http://schemas.microsoft.com/office/word/2006/wordml" xmlns:wps="http://schemas.microsoft.com/office/word/2010/wordprocessingShape" mc:Ignorable="w14 w15 w16se w16cid w16 w16cex w16sdtdh wp14">
+  <w:sdt>
+    <w:sdtPr>
+      <w:id w:val="552194057"/>
+      <w:docPartObj>
+        <w:docPartGallery w:val="Page Numbers (Bottom of Page)"/>
+        <w:docPartUnique/>
+      </w:docPartObj>
+    </w:sdtPr>
+    <w:sdtEndPr>
+      <w:rPr>
+        <w:color w:val="7F7F7F" w:themeColor="background1" w:themeShade="7F"/>
+        <w:spacing w:val="60"/>
+      </w:rPr>
+    </w:sdtEndPr>
+    <w:sdtContent>
+      <w:p>
+        <w:pPr>
+          <w:pStyle w:val="Footer"/>
+          <w:pBdr>
+            <w:top w:val="single" w:sz="4" w:space="1" w:color="D9D9D9" w:themeColor="background1" w:themeShade="D9"/>
+          </w:pBdr>
+          <w:jc w:val="right"/>
+        </w:pPr>
+        <w:r>
+          <w:fldChar w:fldCharType="begin"/>
+        </w:r>
+        <w:r>
+          <w:instrText xml:space="preserve"> PAGE   \* MERGEFORMAT </w:instrText>
+        </w:r>
+        <w:r>
+          <w:fldChar w:fldCharType="separate"/>
+        </w:r>
+        <w:r>
+          <w:rPr>
+            <w:noProof/>
+          </w:rPr>
+          <w:t>2</w:t>
+        </w:r>
+        <w:r>
+          <w:rPr>
+            <w:noProof/>
+          </w:rPr>
+          <w:fldChar w:fldCharType="end"/>
+        </w:r>
+        <w:r>
+          <w:t xml:space="preserve"> | </w:t>
+        </w:r>
+        <w:r>
+          <w:rPr>
+            <w:color w:val="7F7F7F" w:themeColor="background1" w:themeShade="7F"/>
+            <w:spacing w:val="60"/>
+          </w:rPr>
+          <w:t>Page</w:t>
+        </w:r>
+      </w:p>
+    </w:sdtContent>
+  </w:sdt>
+  <w:p>
+    <w:pPr>
+      <w:pStyle w:val="Footer"/>
+    </w:pPr>
+  </w:p>
+</w:ftr>
+</file>
+
+<file path=word/footnotes.xml><?xml version="1.0" encoding="utf-8"?>
+<w:footnotes xmlns:wpc="http://schemas.microsoft.com/office/word/2010/wordprocessingCanvas" xmlns:cx="http://schemas.microsoft.com/office/drawing/2014/chartex" xmlns:cx1="http://schemas.microsoft.com/office/drawing/2015/9/8/chartex" xmlns:cx2="http://schemas.microsoft.com/office/drawing/2015/10/21/chartex" xmlns:cx3="http://schemas.microsoft.com/office/drawing/2016/5/9/chartex" xmlns:cx4="http://schemas.microsoft.com/office/drawing/2016/5/10/chartex" xmlns:cx5="http://schemas.microsoft.com/office/drawing/2016/5/11/chartex" xmlns:cx6="http://schemas.microsoft.com/office/drawing/2016/5/12/chartex" xmlns:cx7="http://schemas.microsoft.com/office/drawing/2016/5/13/chartex" xmlns:cx8="http://schemas.microsoft.com/office/drawing/2016/5/14/chartex" xmlns:mc="http://schemas.openxmlformats.org/markup-compatibility/2006" xmlns:aink="http://schemas.microsoft.com/office/drawing/2016/ink" xmlns:am3d="http://schemas.microsoft.com/office/drawing/2017/model3d" xmlns:o="urn:schemas-microsoft-com:office:office" xmlns:r="http://schemas.openxmlformats.org/officeDocument/2006/relationships" xmlns:m="http://schemas.openxmlformats.org/officeDocument/2006/math" xmlns:v="urn:schemas-microsoft-com:vml" xmlns:wp14="http://schemas.microsoft.com/office/word/2010/wordprocessingDrawing" xmlns:wp="http://schemas.openxmlformats.org/drawingml/2006/wordprocessingDrawing" xmlns:w10="urn:schemas-microsoft-com:office:word" xmlns:w="http://schemas.openxmlformats.org/wordprocessingml/2006/main" xmlns:w14="http://schemas.microsoft.com/office/word/2010/wordml" xmlns:w15="http://schemas.microsoft.com/office/word/2012/wordml" xmlns:w16cex="http://schemas.microsoft.com/office/word/2018/wordml/cex" xmlns:w16cid="http://schemas.microsoft.com/office/word/2016/wordml/cid" xmlns:w16="http://schemas.microsoft.com/office/word/2018/wordml" xmlns:w16sdtdh="http://schemas.microsoft.com/office/word/2020/wordml/sdtdatahash" xmlns:w16se="http://schemas.microsoft.com/office/word/2015/wordml/symex" xmlns:wpg="http://schemas.microsoft.com/office/word/2010/wordprocessingGroup" xmlns:wpi="http://schemas.microsoft.com/office/word/2010/wordprocessingInk" xmlns:wne="http://schemas.microsoft.com/office/word/2006/wordml" xmlns:wps="http://schemas.microsoft.com/office/word/2010/wordprocessingShape" mc:Ignorable="w14 w15 w16se w16cid w16 w16cex w16sdtdh wp14">
+  <w:footnote w:type="separator" w:id="-1">
+    <w:p>
+      <w:pPr>
+        <w:spacing w:after="0" w:line="240" w:lineRule="auto"/>
+      </w:pPr>
+      <w:r>
+        <w:separator/>
+      </w:r>
+    </w:p>
+  </w:footnote>
+  <w:footnote w:type="continuationSeparator" w:id="0">
+    <w:p>
+      <w:pPr>
+        <w:spacing w:after="0" w:line="240" w:lineRule="auto"/>
+      </w:pPr>
+      <w:r>
+        <w:continuationSeparator/>
+      </w:r>
+    </w:p>
+  </w:footnote>
+</w:footnotes>
+</file>
+
+<file path=word/header1.xml><?xml version="1.0" encoding="utf-8"?>
+<w:hdr xmlns:wpc="http://schemas.microsoft.com/office/word/2010/wordprocessingCanvas" xmlns:cx="http://schemas.microsoft.com/office/drawing/2014/chartex" xmlns:cx1="http://schemas.microsoft.com/office/drawing/2015/9/8/chartex" xmlns:cx2="http://schemas.microsoft.com/office/drawing/2015/10/21/chartex" xmlns:cx3="http://schemas.microsoft.com/office/drawing/2016/5/9/chartex" xmlns:cx4="http://schemas.microsoft.com/office/drawing/2016/5/10/chartex" xmlns:cx5="http://schemas.microsoft.com/office/drawing/2016/5/11/chartex" xmlns:cx6="http://schemas.microsoft.com/office/drawing/2016/5/12/chartex" xmlns:cx7="http://schemas.microsoft.com/office/drawing/2016/5/13/chartex" xmlns:cx8="http://schemas.microsoft.com/office/drawing/2016/5/14/chartex" xmlns:mc="http://schemas.openxmlformats.org/markup-compatibility/2006" xmlns:aink="http://schemas.microsoft.com/office/drawing/2016/ink" xmlns:am3d="http://schemas.microsoft.com/office/drawing/2017/model3d" xmlns:o="urn:schemas-microsoft-com:office:office" xmlns:r="http://schemas.openxmlformats.org/officeDocument/2006/relationships" xmlns:m="http://schemas.openxmlformats.org/officeDocument/2006/math" xmlns:v="urn:schemas-microsoft-com:vml" xmlns:wp14="http://schemas.microsoft.com/office/word/2010/wordprocessingDrawing" xmlns:wp="http://schemas.openxmlformats.org/drawingml/2006/wordprocessingDrawing" xmlns:w10="urn:schemas-microsoft-com:office:word" xmlns:w="http://schemas.openxmlformats.org/wordprocessingml/2006/main" xmlns:w14="http://schemas.microsoft.com/office/word/2010/wordml" xmlns:w15="http://schemas.microsoft.com/office/word/2012/wordml" xmlns:w16cex="http://schemas.microsoft.com/office/word/2018/wordml/cex" xmlns:w16cid="http://schemas.microsoft.com/office/word/2016/wordml/cid" xmlns:w16="http://schemas.microsoft.com/office/word/2018/wordml" xmlns:w16sdtdh="http://schemas.microsoft.com/office/word/2020/wordml/sdtdatahash" xmlns:w16se="http://schemas.microsoft.com/office/word/2015/wordml/symex" xmlns:wpg="http://schemas.microsoft.com/office/word/2010/wordprocessingGroup" xmlns:wpi="http://schemas.microsoft.com/office/word/2010/wordprocessingInk" xmlns:wne="http://schemas.microsoft.com/office/word/2006/wordml" xmlns:wps="http://schemas.microsoft.com/office/word/2010/wordprocessingShape" mc:Ignorable="w14 w15 w16se w16cid w16 w16cex w16sdtdh wp14">
+  <w:p>
+    <w:pPr>
+      <w:pStyle w:val="Header"/>
+    </w:pPr>
+    <w:r>
+      <w:t>Team SEA</w:t>
+    </w:r>
+    <w:r>
+      <w:ptab w:relativeTo="margin" w:alignment="center" w:leader="none"/>
+    </w:r>
+    <w:r>
+      <w:ptab w:relativeTo="margin" w:alignment="right" w:leader="none"/>
+    </w:r>
+    <w:r>
+      <w:t>2026</w:t>
+    </w:r>
+  </w:p>
+</w:hdr>
+</file>
+
 <file path=word/numbering.xml><?xml version="1.0" encoding="utf-8"?>
-<w:numbering xmlns:wpc="http://schemas.microsoft.com/office/word/2010/wordprocessingCanvas" xmlns:cx="http://schemas.microsoft.com/office/drawing/2014/chartex" xmlns:cx1="http://schemas.microsoft.com/office/drawing/2015/9/8/chartex" xmlns:cx2="http://schemas.microsoft.com/office/drawing/2015/10/21/chartex" xmlns:cx3="http://schemas.microsoft.com/office/drawing/2016/5/9/chartex" xmlns:cx4="http://schemas.microsoft.com/office/drawing/2016/5/10/chartex" xmlns:cx5="http://schemas.microsoft.com/office/drawing/2016/5/11/chartex" xmlns:cx6="http://schemas.microsoft.com/office/drawing/2016/5/12/chartex" xmlns:cx7="http://schemas.microsoft.com/office/drawing/2016/5/13/chartex" xmlns:cx8="http://schemas.microsoft.com/office/drawing/2016/5/14/chartex" xmlns:mc="http://schemas.openxmlformats.org/markup-compatibility/2006" xmlns:aink="http://schemas.microsoft.com/office/drawing/2016/ink" xmlns:am3d="http://schemas.microsoft.com/office/drawing/2017/model3d" xmlns:o="urn:schemas-microsoft-com:office:office" xmlns:oel="http://schemas.microsoft.com/office/2019/extlst" xmlns:r="http://schemas.openxmlformats.org/officeDocument/2006/relationships" xmlns:m="http://schemas.openxmlformats.org/officeDocument/2006/math" xmlns:v="urn:schemas-microsoft-com:vml" xmlns:wp14="http://schemas.microsoft.com/office/word/2010/wordprocessingDrawing" xmlns:wp="http://schemas.openxmlformats.org/drawingml/2006/wordprocessingDrawing" xmlns:w10="urn:schemas-microsoft-com:office:word" xmlns:w="http://schemas.openxmlformats.org/wordprocessingml/2006/main" xmlns:w14="http://schemas.microsoft.com/office/word/2010/wordml" xmlns:w15="http://schemas.microsoft.com/office/word/2012/wordml" xmlns:w16cex="http://schemas.microsoft.com/office/word/2018/wordml/cex" xmlns:w16cid="http://schemas.microsoft.com/office/word/2016/wordml/cid" xmlns:w16="http://schemas.microsoft.com/office/word/2018/wordml" xmlns:w16du="http://schemas.microsoft.com/office/word/2023/wordml/word16du" xmlns:w16sdtdh="http://schemas.microsoft.com/office/word/2020/wordml/sdtdatahash" xmlns:w16sdtfl="http://schemas.microsoft.com/office/word/2024/wordml/sdtformatlock" xmlns:w16se="http://schemas.microsoft.com/office/word/2015/wordml/symex" xmlns:wpg="http://schemas.microsoft.com/office/word/2010/wordprocessingGroup" xmlns:wpi="http://schemas.microsoft.com/office/word/2010/wordprocessingInk" xmlns:wne="http://schemas.microsoft.com/office/word/2006/wordml" xmlns:wps="http://schemas.microsoft.com/office/word/2010/wordprocessingShape" mc:Ignorable="w14 w15 w16se w16cid w16 w16cex w16sdtdh w16sdtfl w16du wp14">
+<w:numbering xmlns:wpc="http://schemas.microsoft.com/office/word/2010/wordprocessingCanvas" xmlns:cx="http://schemas.microsoft.com/office/drawing/2014/chartex" xmlns:cx1="http://schemas.microsoft.com/office/drawing/2015/9/8/chartex" xmlns:cx2="http://schemas.microsoft.com/office/drawing/2015/10/21/chartex" xmlns:cx3="http://schemas.microsoft.com/office/drawing/2016/5/9/chartex" xmlns:cx4="http://schemas.microsoft.com/office/drawing/2016/5/10/chartex" xmlns:cx5="http://schemas.microsoft.com/office/drawing/2016/5/11/chartex" xmlns:cx6="http://schemas.microsoft.com/office/drawing/2016/5/12/chartex" xmlns:cx7="http://schemas.microsoft.com/office/drawing/2016/5/13/chartex" xmlns:cx8="http://schemas.microsoft.com/office/drawing/2016/5/14/chartex" xmlns:mc="http://schemas.openxmlformats.org/markup-compatibility/2006" xmlns:aink="http://schemas.microsoft.com/office/drawing/2016/ink" xmlns:am3d="http://schemas.microsoft.com/office/drawing/2017/model3d" xmlns:o="urn:schemas-microsoft-com:office:office" xmlns:r="http://schemas.openxmlformats.org/officeDocument/2006/relationships" xmlns:m="http://schemas.openxmlformats.org/officeDocument/2006/math" xmlns:v="urn:schemas-microsoft-com:vml" xmlns:wp14="http://schemas.microsoft.com/office/word/2010/wordprocessingDrawing" xmlns:wp="http://schemas.openxmlformats.org/drawingml/2006/wordprocessingDrawing" xmlns:w10="urn:schemas-microsoft-com:office:word" xmlns:w="http://schemas.openxmlformats.org/wordprocessingml/2006/main" xmlns:w14="http://schemas.microsoft.com/office/word/2010/wordml" xmlns:w15="http://schemas.microsoft.com/office/word/2012/wordml" xmlns:w16cex="http://schemas.microsoft.com/office/word/2018/wordml/cex" xmlns:w16cid="http://schemas.microsoft.com/office/word/2016/wordml/cid" xmlns:w16="http://schemas.microsoft.com/office/word/2018/wordml" xmlns:w16sdtdh="http://schemas.microsoft.com/office/word/2020/wordml/sdtdatahash" xmlns:w16se="http://schemas.microsoft.com/office/word/2015/wordml/symex" xmlns:wpg="http://schemas.microsoft.com/office/word/2010/wordprocessingGroup" xmlns:wpi="http://schemas.microsoft.com/office/word/2010/wordprocessingInk" xmlns:wne="http://schemas.microsoft.com/office/word/2006/wordml" xmlns:wps="http://schemas.microsoft.com/office/word/2010/wordprocessingShape" mc:Ignorable="w14 w15 w16se w16cid w16 w16cex w16sdtdh wp14">
   <w:abstractNum w:abstractNumId="0" w15:restartNumberingAfterBreak="0">
     <w:nsid w:val="0D175DD0"/>
     <w:multiLevelType w:val="hybridMultilevel"/>
@@ -2627,7 +2928,7 @@
   <w:abstractNum w:abstractNumId="9" w15:restartNumberingAfterBreak="0">
     <w:nsid w:val="7C5B7792"/>
     <w:multiLevelType w:val="multilevel"/>
-    <w:tmpl w:val="3142F7D8"/>
+    <w:tmpl w:val="E1F2B8F4"/>
     <w:lvl w:ilvl="0">
       <w:start w:val="1"/>
       <w:numFmt w:val="decimal"/>
@@ -2637,7 +2938,7 @@
         <w:ind w:left="360" w:hanging="360"/>
       </w:pPr>
       <w:rPr>
-        <w:rFonts w:hint="default"/>
+        <w:rFonts w:asciiTheme="majorHAnsi" w:eastAsiaTheme="majorEastAsia" w:hAnsiTheme="majorHAnsi" w:cstheme="majorBidi"/>
       </w:rPr>
     </w:lvl>
     <w:lvl w:ilvl="1">
@@ -2745,41 +3046,41 @@
       </w:rPr>
     </w:lvl>
   </w:abstractNum>
-  <w:num w:numId="1" w16cid:durableId="1567178560">
+  <w:num w:numId="1">
     <w:abstractNumId w:val="6"/>
   </w:num>
-  <w:num w:numId="2" w16cid:durableId="1850217956">
+  <w:num w:numId="2">
     <w:abstractNumId w:val="9"/>
   </w:num>
-  <w:num w:numId="3" w16cid:durableId="453141608">
+  <w:num w:numId="3">
     <w:abstractNumId w:val="2"/>
   </w:num>
-  <w:num w:numId="4" w16cid:durableId="1883050857">
+  <w:num w:numId="4">
     <w:abstractNumId w:val="3"/>
   </w:num>
-  <w:num w:numId="5" w16cid:durableId="1183738912">
+  <w:num w:numId="5">
     <w:abstractNumId w:val="4"/>
   </w:num>
-  <w:num w:numId="6" w16cid:durableId="1084958701">
+  <w:num w:numId="6">
     <w:abstractNumId w:val="7"/>
   </w:num>
-  <w:num w:numId="7" w16cid:durableId="316611379">
+  <w:num w:numId="7">
     <w:abstractNumId w:val="1"/>
   </w:num>
-  <w:num w:numId="8" w16cid:durableId="1157262716">
+  <w:num w:numId="8">
     <w:abstractNumId w:val="0"/>
   </w:num>
-  <w:num w:numId="9" w16cid:durableId="243733150">
+  <w:num w:numId="9">
     <w:abstractNumId w:val="8"/>
   </w:num>
-  <w:num w:numId="10" w16cid:durableId="1417747326">
+  <w:num w:numId="10">
     <w:abstractNumId w:val="5"/>
   </w:num>
 </w:numbering>
 </file>
 
 <file path=word/styles.xml><?xml version="1.0" encoding="utf-8"?>
-<w:styles xmlns:mc="http://schemas.openxmlformats.org/markup-compatibility/2006" xmlns:r="http://schemas.openxmlformats.org/officeDocument/2006/relationships" xmlns:w="http://schemas.openxmlformats.org/wordprocessingml/2006/main" xmlns:w14="http://schemas.microsoft.com/office/word/2010/wordml" xmlns:w15="http://schemas.microsoft.com/office/word/2012/wordml" xmlns:w16cex="http://schemas.microsoft.com/office/word/2018/wordml/cex" xmlns:w16cid="http://schemas.microsoft.com/office/word/2016/wordml/cid" xmlns:w16="http://schemas.microsoft.com/office/word/2018/wordml" xmlns:w16du="http://schemas.microsoft.com/office/word/2023/wordml/word16du" xmlns:w16sdtdh="http://schemas.microsoft.com/office/word/2020/wordml/sdtdatahash" xmlns:w16sdtfl="http://schemas.microsoft.com/office/word/2024/wordml/sdtformatlock" xmlns:w16se="http://schemas.microsoft.com/office/word/2015/wordml/symex" mc:Ignorable="w14 w15 w16se w16cid w16 w16cex w16sdtdh w16sdtfl w16du">
+<w:styles xmlns:mc="http://schemas.openxmlformats.org/markup-compatibility/2006" xmlns:r="http://schemas.openxmlformats.org/officeDocument/2006/relationships" xmlns:w="http://schemas.openxmlformats.org/wordprocessingml/2006/main" xmlns:w14="http://schemas.microsoft.com/office/word/2010/wordml" xmlns:w15="http://schemas.microsoft.com/office/word/2012/wordml" xmlns:w16cex="http://schemas.microsoft.com/office/word/2018/wordml/cex" xmlns:w16cid="http://schemas.microsoft.com/office/word/2016/wordml/cid" xmlns:w16="http://schemas.microsoft.com/office/word/2018/wordml" xmlns:w16sdtdh="http://schemas.microsoft.com/office/word/2020/wordml/sdtdatahash" xmlns:w16se="http://schemas.microsoft.com/office/word/2015/wordml/symex" mc:Ignorable="w14 w15 w16se w16cid w16 w16cex w16sdtdh">
   <w:docDefaults>
     <w:rPrDefault>
       <w:rPr>
@@ -3383,6 +3684,7 @@
   <w:style w:type="character" w:default="1" w:styleId="DefaultParagraphFont">
     <w:name w:val="Default Paragraph Font"/>
     <w:uiPriority w:val="1"/>
+    <w:semiHidden/>
     <w:unhideWhenUsed/>
   </w:style>
   <w:style w:type="table" w:default="1" w:styleId="TableNormal">
@@ -3693,6 +3995,80 @@
       <w:smallCaps/>
       <w:color w:val="0F4761" w:themeColor="accent1" w:themeShade="BF"/>
       <w:spacing w:val="5"/>
+    </w:rPr>
+  </w:style>
+  <w:style w:type="paragraph" w:styleId="Header">
+    <w:name w:val="header"/>
+    <w:basedOn w:val="Normal"/>
+    <w:link w:val="HeaderChar"/>
+    <w:uiPriority w:val="99"/>
+    <w:unhideWhenUsed/>
+    <w:rsid w:val="00824E22"/>
+    <w:pPr>
+      <w:tabs>
+        <w:tab w:val="center" w:pos="4513"/>
+        <w:tab w:val="right" w:pos="9026"/>
+      </w:tabs>
+      <w:spacing w:after="0" w:line="240" w:lineRule="auto"/>
+    </w:pPr>
+  </w:style>
+  <w:style w:type="character" w:customStyle="1" w:styleId="HeaderChar">
+    <w:name w:val="Header Char"/>
+    <w:basedOn w:val="DefaultParagraphFont"/>
+    <w:link w:val="Header"/>
+    <w:uiPriority w:val="99"/>
+    <w:rsid w:val="00824E22"/>
+    <w:rPr>
+      <w:lang w:val="en-GB"/>
+    </w:rPr>
+  </w:style>
+  <w:style w:type="paragraph" w:styleId="Footer">
+    <w:name w:val="footer"/>
+    <w:basedOn w:val="Normal"/>
+    <w:link w:val="FooterChar"/>
+    <w:uiPriority w:val="99"/>
+    <w:unhideWhenUsed/>
+    <w:rsid w:val="00824E22"/>
+    <w:pPr>
+      <w:tabs>
+        <w:tab w:val="center" w:pos="4513"/>
+        <w:tab w:val="right" w:pos="9026"/>
+      </w:tabs>
+      <w:spacing w:after="0" w:line="240" w:lineRule="auto"/>
+    </w:pPr>
+  </w:style>
+  <w:style w:type="character" w:customStyle="1" w:styleId="FooterChar">
+    <w:name w:val="Footer Char"/>
+    <w:basedOn w:val="DefaultParagraphFont"/>
+    <w:link w:val="Footer"/>
+    <w:uiPriority w:val="99"/>
+    <w:rsid w:val="00824E22"/>
+    <w:rPr>
+      <w:lang w:val="en-GB"/>
+    </w:rPr>
+  </w:style>
+  <w:style w:type="paragraph" w:styleId="BodyText">
+    <w:name w:val="Body Text"/>
+    <w:basedOn w:val="Normal"/>
+    <w:link w:val="BodyTextChar"/>
+    <w:uiPriority w:val="99"/>
+    <w:unhideWhenUsed/>
+    <w:rsid w:val="00E75433"/>
+    <w:rPr>
+      <w:sz w:val="28"/>
+      <w:szCs w:val="28"/>
+    </w:rPr>
+  </w:style>
+  <w:style w:type="character" w:customStyle="1" w:styleId="BodyTextChar">
+    <w:name w:val="Body Text Char"/>
+    <w:basedOn w:val="DefaultParagraphFont"/>
+    <w:link w:val="BodyText"/>
+    <w:uiPriority w:val="99"/>
+    <w:rsid w:val="00E75433"/>
+    <w:rPr>
+      <w:sz w:val="28"/>
+      <w:szCs w:val="28"/>
+      <w:lang w:val="en-GB"/>
     </w:rPr>
   </w:style>
 </w:styles>

</xml_diff>